<commit_message>
feat: implement ZGM feedback — rename enrichment→comments, add filters & dashboards
Incorporates David (ZGM) stakeholder feedback from Feb 26 review:
- Rename "Enrichment" → "Comments" in all user-facing text
- Rename "Region" → "Zone" throughout
- Add BM → AM → GM → Zone hierarchy to lead detail views
- Add "Data as of" date to top bar
- Add Insurance Company filter to lead queue and compliance dashboard
- Add HRD vs Branch contact source breakdown to GM dashboard
- Add Time to First Contact distribution card to GM dashboard
- Add Leaderboard with Most Improved toggle and week-over-week deltas
- Add AM and Zone columns to Org Mapping table

Co-Authored-By: Claude Opus 4.6 <noreply@anthropic.com>
</commit_message>
<xml_diff>
--- a/docs/word_exports/commercial-excellence-campaign.docx
+++ b/docs/word_exports/commercial-excellence-campaign.docx
@@ -2,7 +2,7 @@
 <file path=word/document.xml><?xml version="1.0" encoding="utf-8"?>
 <w:document xmlns:w="http://schemas.openxmlformats.org/wordprocessingml/2006/main" xmlns:m="http://schemas.openxmlformats.org/officeDocument/2006/math" xmlns:r="http://schemas.openxmlformats.org/officeDocument/2006/relationships" xmlns:o="urn:schemas-microsoft-com:office:office" xmlns:v="urn:schemas-microsoft-com:vml" xmlns:w10="urn:schemas-microsoft-com:office:word" xmlns:a="http://schemas.openxmlformats.org/drawingml/2006/main" xmlns:pic="http://schemas.openxmlformats.org/drawingml/2006/picture" xmlns:wp="http://schemas.openxmlformats.org/drawingml/2006/wordprocessingDrawing">
   <w:body>
-    <w:bookmarkStart w:id="36" w:name="Xd75d7f4e42f53c1a2729e7a370b4939dbe0be64"/>
+    <w:bookmarkStart w:id="39" w:name="Xd75d7f4e42f53c1a2729e7a370b4939dbe0be64"/>
     <w:p>
       <w:pPr>
         <w:pStyle w:val="Heading1"/>
@@ -231,7 +231,7 @@
         <w:t xml:space="preserve"> </w:t>
       </w:r>
       <w:r>
-        <w:t xml:space="preserve">— GMs and branch managers reviewing pipeline and conversion together</w:t>
+        <w:t xml:space="preserve">— Branch managers reviewing pipeline and conversion regularly</w:t>
       </w:r>
     </w:p>
     <w:p>
@@ -856,7 +856,7 @@
         <w:pStyle w:val="FirstParagraph"/>
       </w:pPr>
       <w:r>
-        <w:t xml:space="preserve">Equip every branch manager and general manager with the knowledge, tools, and accountability to execute Insurance Replacement operations at the standard of our best branches — targeting 75–80%+ conversion across the network.</w:t>
+        <w:t xml:space="preserve">Equip every branch manager and their direct reports (MAs and MTs) with the knowledge, tools, and accountability to execute Insurance Replacement operations at the standard of our best branches — targeting 75–80%+ conversion across the network.</w:t>
       </w:r>
     </w:p>
     <w:bookmarkEnd w:id="13"/>
@@ -890,7 +890,20 @@
         <w:t xml:space="preserve"> </w:t>
       </w:r>
       <w:r>
-        <w:t xml:space="preserve">of structured sessions, delivered fortnightly on Tuesdays. Session 1 is a kick-off meeting where Gim sets the vision and introduces the series. From Session 2 onwards, the programme transitions to</w:t>
+        <w:t xml:space="preserve">of structured sessions, delivered fortnightly on Wednesdays to</w:t>
+      </w:r>
+      <w:r>
+        <w:t xml:space="preserve"> </w:t>
+      </w:r>
+      <w:r>
+        <w:rPr>
+          <w:b/>
+          <w:bCs/>
+        </w:rPr>
+        <w:t xml:space="preserve">all Branch Managers and their direct reports (MAs and MTs)</w:t>
+      </w:r>
+      <w:r>
+        <w:t xml:space="preserve">. Session 1 is a kick-off meeting where Gim sets the vision and introduces the series. From Session 2 onwards, the programme transitions to</w:t>
       </w:r>
       <w:r>
         <w:t xml:space="preserve"> </w:t>
@@ -906,7 +919,7 @@
         <w:t xml:space="preserve"> </w:t>
       </w:r>
       <w:r>
-        <w:t xml:space="preserve">— a recorded, 30-minute podcast-style session on Microsoft Teams where Gim speaks to one topic per episode, often with a guest Branch Manager or GM.</w:t>
+        <w:t xml:space="preserve">— a recorded, 30-minute podcast-style session on Microsoft Teams where Gim speaks to one topic per episode, often with a guest Branch Manager.</w:t>
       </w:r>
     </w:p>
     <w:p>
@@ -933,6 +946,40 @@
         <w:t xml:space="preserve">— a sustained, visible, leadership-led push to raise the operational bar across the network. Think of it as a marketing campaign for operational excellence: continuous hype, continuous content, continuous momentum.</w:t>
       </w:r>
     </w:p>
+    <w:p>
+      <w:pPr>
+        <w:pStyle w:val="BlockText"/>
+      </w:pPr>
+      <w:r>
+        <w:rPr>
+          <w:b/>
+          <w:bCs/>
+        </w:rPr>
+        <w:t xml:space="preserve">Note:</w:t>
+      </w:r>
+      <w:r>
+        <w:t xml:space="preserve"> </w:t>
+      </w:r>
+      <w:r>
+        <w:t xml:space="preserve">Area Managers and General Managers are not part of the session audience. Gim holds a</w:t>
+      </w:r>
+      <w:r>
+        <w:t xml:space="preserve"> </w:t>
+      </w:r>
+      <w:r>
+        <w:rPr>
+          <w:b/>
+          <w:bCs/>
+        </w:rPr>
+        <w:t xml:space="preserve">separate monthly cadence with AMs and GMs</w:t>
+      </w:r>
+      <w:r>
+        <w:t xml:space="preserve"> </w:t>
+      </w:r>
+      <w:r>
+        <w:t xml:space="preserve">to cover strategic oversight, cascade learnings, and address questions bubbled up from the branch-level sessions.</w:t>
+      </w:r>
+    </w:p>
     <w:bookmarkEnd w:id="14"/>
     <w:bookmarkStart w:id="15" w:name="design-principles"/>
     <w:p>
@@ -1006,7 +1053,7 @@
         <w:t xml:space="preserve"> </w:t>
       </w:r>
       <w:r>
-        <w:t xml:space="preserve">Gim follows up directly — phone calls to branch managers, checking in on actions. The interaction happens 1:1, not in a town hall Q&amp;A.</w:t>
+        <w:t xml:space="preserve">Gim follows up directly — phone calls to branch managers, checking in on actions. The interaction happens 1:1, not in a broadcast setting.</w:t>
       </w:r>
     </w:p>
     <w:p>
@@ -1022,13 +1069,13 @@
           <w:b/>
           <w:bCs/>
         </w:rPr>
-        <w:t xml:space="preserve">Action-oriented.</w:t>
-      </w:r>
-      <w:r>
-        <w:t xml:space="preserve"> </w:t>
-      </w:r>
-      <w:r>
-        <w:t xml:space="preserve">Every session ends with 1–2 specific things participants will do differently starting that week.</w:t>
+        <w:t xml:space="preserve">One-way broadcast.</w:t>
+      </w:r>
+      <w:r>
+        <w:t xml:space="preserve"> </w:t>
+      </w:r>
+      <w:r>
+        <w:t xml:space="preserve">Sessions are delivered as a one-way broadcast: microphones and cameras OFF for attendees, Q&amp;A turned off, chat turned off, reactions ON (hand clapping, laughing emojis). This keeps sessions tight and within 30 minutes. Common questions are bubbled up to the separate AM/GM monthly calls with Gim.</w:t>
       </w:r>
     </w:p>
     <w:p>
@@ -1044,13 +1091,13 @@
           <w:b/>
           <w:bCs/>
         </w:rPr>
-        <w:t xml:space="preserve">Recorded.</w:t>
-      </w:r>
-      <w:r>
-        <w:t xml:space="preserve"> </w:t>
-      </w:r>
-      <w:r>
-        <w:t xml:space="preserve">Every session is recorded on Teams and packaged as a podcast episode for on-demand listening, catch-up, and new starter onboarding.</w:t>
+        <w:t xml:space="preserve">Action-oriented.</w:t>
+      </w:r>
+      <w:r>
+        <w:t xml:space="preserve"> </w:t>
+      </w:r>
+      <w:r>
+        <w:t xml:space="preserve">Every session ends with 1–2 specific things participants will do differently starting that week.</w:t>
       </w:r>
     </w:p>
     <w:p>
@@ -1066,13 +1113,13 @@
           <w:b/>
           <w:bCs/>
         </w:rPr>
-        <w:t xml:space="preserve">Cascadable.</w:t>
-      </w:r>
-      <w:r>
-        <w:t xml:space="preserve"> </w:t>
-      </w:r>
-      <w:r>
-        <w:t xml:space="preserve">Select sessions are designed for GMs to re-run with their own branch managers, extending reach without requiring everyone in one room.</w:t>
+        <w:t xml:space="preserve">Recorded.</w:t>
+      </w:r>
+      <w:r>
+        <w:t xml:space="preserve"> </w:t>
+      </w:r>
+      <w:r>
+        <w:t xml:space="preserve">Every session is recorded on Teams and packaged as a podcast episode for on-demand listening, catch-up, and new starter onboarding.</w:t>
       </w:r>
     </w:p>
     <w:p>
@@ -1136,7 +1183,7 @@
               <w:pStyle w:val="Compact"/>
             </w:pPr>
             <w:r>
-              <w:t xml:space="preserve">Set the vision. Walk through the one-pager. Align on why IR matters, what good looks like, and what the campaign will cover. Introduce the</w:t>
+              <w:t xml:space="preserve">Set the tone — casual, direct, from Gim. Walk through the one-pager. Align on why IR matters, what good looks like, and what the campaign will cover. Introduce the</w:t>
             </w:r>
             <w:r>
               <w:t xml:space="preserve"> </w:t>
@@ -1204,7 +1251,7 @@
               <w:pStyle w:val="Compact"/>
             </w:pPr>
             <w:r>
-              <w:t xml:space="preserve">All General Managers + All Branch Managers</w:t>
+              <w:t xml:space="preserve">All Branch Managers + MAs/MTs</w:t>
             </w:r>
           </w:p>
         </w:tc>
@@ -1232,7 +1279,7 @@
               <w:pStyle w:val="Compact"/>
             </w:pPr>
             <w:r>
-              <w:t xml:space="preserve">Kick-off meeting: company vision and introduction (10 min) + Claims to Keys topic (20 min). Virtual (Microsoft Teams). Recorded.</w:t>
+              <w:t xml:space="preserve">Kick-off session: Gim sets the vision and kicks off the series in his own style — conversational, not corporate. Virtual (Microsoft Teams). One-way broadcast. Recorded.</w:t>
             </w:r>
           </w:p>
         </w:tc>
@@ -1294,7 +1341,51 @@
               <w:t xml:space="preserve"> </w:t>
             </w:r>
             <w:r>
-              <w:t xml:space="preserve">one-pager (emailed personally by Gim, printed and posted at branches), campaign calendar?</w:t>
+              <w:t xml:space="preserve">one-pager (emailed personally by Gim),</w:t>
+            </w:r>
+            <w:r>
+              <w:t xml:space="preserve"> </w:t>
+            </w:r>
+            <w:r>
+              <w:rPr>
+                <w:b/>
+                <w:bCs/>
+              </w:rPr>
+              <w:t xml:space="preserve">A3 poster</w:t>
+            </w:r>
+            <w:r>
+              <w:t xml:space="preserve"> </w:t>
+            </w:r>
+            <w:r>
+              <w:t xml:space="preserve">placed on HR boards / break rooms (laminated or cardboard for durability — not customer-facing, as metrics like</w:t>
+            </w:r>
+            <w:r>
+              <w:t xml:space="preserve"> </w:t>
+            </w:r>
+            <w:r>
+              <w:t xml:space="preserve">“first contact within 30 minutes”</w:t>
+            </w:r>
+            <w:r>
+              <w:t xml:space="preserve"> </w:t>
+            </w:r>
+            <w:r>
+              <w:t xml:space="preserve">could prompt complaints).</w:t>
+            </w:r>
+            <w:r>
+              <w:t xml:space="preserve"> </w:t>
+            </w:r>
+            <w:r>
+              <w:rPr>
+                <w:b/>
+                <w:bCs/>
+              </w:rPr>
+              <w:t xml:space="preserve">A4 version</w:t>
+            </w:r>
+            <w:r>
+              <w:t xml:space="preserve"> </w:t>
+            </w:r>
+            <w:r>
+              <w:t xml:space="preserve">added to new hire training binders.</w:t>
             </w:r>
           </w:p>
         </w:tc>
@@ -1350,7 +1441,7 @@
               <w:pStyle w:val="Compact"/>
             </w:pPr>
             <w:r>
-              <w:t xml:space="preserve">Every branch manager reviews their own conversion rate before next session. GMs identify their top and bottom 3 branches, and 1 thing they will do differently</w:t>
+              <w:t xml:space="preserve">Every branch manager reviews their own conversion rate before next session.</w:t>
             </w:r>
           </w:p>
         </w:tc>
@@ -1364,13 +1455,35 @@
       </w:r>
     </w:p>
     <w:bookmarkEnd w:id="17"/>
-    <w:bookmarkStart w:id="18" w:name="X3c7f1f9a8d9051bcd998944fe84eca57dfce3f4"/>
+    <w:bookmarkStart w:id="18" w:name="X135e8df8dbc93717813c897b727a4e7f12a84aa"/>
     <w:p>
       <w:pPr>
         <w:pStyle w:val="Heading3"/>
       </w:pPr>
       <w:r>
-        <w:t xml:space="preserve">Bonus Episode — Gim’s Journey: From Team Member to VP</w:t>
+        <w:t xml:space="preserve">Session 2 — Own It: The</w:t>
+      </w:r>
+      <w:r>
+        <w:t xml:space="preserve"> </w:t>
+      </w:r>
+      <w:r>
+        <w:t xml:space="preserve">“Yes We Can”</w:t>
+      </w:r>
+      <w:r>
+        <w:t xml:space="preserve"> </w:t>
+      </w:r>
+      <w:r>
+        <w:t xml:space="preserve">Mentality</w:t>
+      </w:r>
+      <w:r>
+        <w:t xml:space="preserve"> </w:t>
+      </w:r>
+      <w:r>
+        <w:rPr>
+          <w:i/>
+          <w:iCs/>
+        </w:rPr>
+        <w:t xml:space="preserve">(Gim Unfiltered Ep. 1)</w:t>
       </w:r>
     </w:p>
     <w:tbl>
@@ -1407,7 +1520,13 @@
               <w:pStyle w:val="Compact"/>
             </w:pPr>
             <w:r>
-              <w:t xml:space="preserve">Build credibility and connection. Gim shares his personal journey through Hertz — from the ground up to leading operations. Reinforces why this campaign matters to him personally and why he believes in the people doing this work.</w:t>
+              <w:t xml:space="preserve">Instill ownership mindset. Every lead is MY lead, MY revenue, MY business. Dedicated EDI owners, 15-minute HLES checks,</w:t>
+            </w:r>
+            <w:r>
+              <w:t xml:space="preserve"> </w:t>
+            </w:r>
+            <w:r>
+              <w:t xml:space="preserve">“book first, figure out logistics later.”</w:t>
             </w:r>
           </w:p>
         </w:tc>
@@ -1463,7 +1582,35 @@
               <w:pStyle w:val="Compact"/>
             </w:pPr>
             <w:r>
-              <w:t xml:space="preserve">None (solo episode)</w:t>
+              <w:t xml:space="preserve">1–2 top-performing Branch Managers</w:t>
+            </w:r>
+          </w:p>
+        </w:tc>
+      </w:tr>
+      <w:tr>
+        <w:tc>
+          <w:tcPr/>
+          <w:p>
+            <w:pPr>
+              <w:pStyle w:val="Compact"/>
+            </w:pPr>
+            <w:r>
+              <w:rPr>
+                <w:b/>
+                <w:bCs/>
+              </w:rPr>
+              <w:t xml:space="preserve">Audience</w:t>
+            </w:r>
+          </w:p>
+        </w:tc>
+        <w:tc>
+          <w:tcPr/>
+          <w:p>
+            <w:pPr>
+              <w:pStyle w:val="Compact"/>
+            </w:pPr>
+            <w:r>
+              <w:t xml:space="preserve">All Branch Managers + MAs/MTs</w:t>
             </w:r>
           </w:p>
         </w:tc>
@@ -1491,7 +1638,7 @@
               <w:pStyle w:val="Compact"/>
             </w:pPr>
             <w:r>
-              <w:t xml:space="preserve">Pre-recorded. Drops between Session 1 and Session 2 as part of the hype cycle.</w:t>
+              <w:t xml:space="preserve">Gim Unfiltered podcast episode. Virtual (Microsoft Teams). One-way broadcast. Recorded.</w:t>
             </w:r>
           </w:p>
         </w:tc>
@@ -1519,75 +1666,103 @@
               <w:pStyle w:val="Compact"/>
             </w:pPr>
             <w:r>
-              <w:t xml:space="preserve">15–20 minutes</w:t>
-            </w:r>
-          </w:p>
-        </w:tc>
-      </w:tr>
-      <w:tr>
-        <w:tc>
-          <w:tcPr/>
-          <w:p>
-            <w:pPr>
-              <w:pStyle w:val="Compact"/>
-            </w:pPr>
-            <w:r>
-              <w:rPr>
-                <w:b/>
-                <w:bCs/>
-              </w:rPr>
-              <w:t xml:space="preserve">Distribution</w:t>
-            </w:r>
-          </w:p>
-        </w:tc>
-        <w:tc>
-          <w:tcPr/>
-          <w:p>
-            <w:pPr>
-              <w:pStyle w:val="Compact"/>
-            </w:pPr>
-            <w:r>
-              <w:t xml:space="preserve">Packaged as the first</w:t>
+              <w:t xml:space="preserve">30 minutes</w:t>
+            </w:r>
+          </w:p>
+        </w:tc>
+      </w:tr>
+      <w:tr>
+        <w:tc>
+          <w:tcPr/>
+          <w:p>
+            <w:pPr>
+              <w:pStyle w:val="Compact"/>
+            </w:pPr>
+            <w:r>
+              <w:rPr>
+                <w:b/>
+                <w:bCs/>
+              </w:rPr>
+              <w:t xml:space="preserve">Artefacts</w:t>
+            </w:r>
+          </w:p>
+        </w:tc>
+        <w:tc>
+          <w:tcPr/>
+          <w:p>
+            <w:pPr>
+              <w:pStyle w:val="Compact"/>
+            </w:pPr>
+            <w:r>
+              <w:t xml:space="preserve">EDI lead ownership checklist, sample daily HLES check routine</w:t>
+            </w:r>
+          </w:p>
+        </w:tc>
+      </w:tr>
+      <w:tr>
+        <w:tc>
+          <w:tcPr/>
+          <w:p>
+            <w:pPr>
+              <w:pStyle w:val="Compact"/>
+            </w:pPr>
+            <w:r>
+              <w:rPr>
+                <w:b/>
+                <w:bCs/>
+              </w:rPr>
+              <w:t xml:space="preserve">Discussion Prompts</w:t>
+            </w:r>
+          </w:p>
+        </w:tc>
+        <w:tc>
+          <w:tcPr/>
+          <w:p>
+            <w:pPr>
+              <w:pStyle w:val="Compact"/>
+            </w:pPr>
+            <w:r>
+              <w:t xml:space="preserve">“What stops you from saying yes?”</w:t>
             </w:r>
             <w:r>
               <w:t xml:space="preserve"> </w:t>
             </w:r>
             <w:r>
-              <w:t xml:space="preserve">“Gim Unfiltered”</w:t>
+              <w:t xml:space="preserve">/</w:t>
             </w:r>
             <w:r>
               <w:t xml:space="preserve"> </w:t>
             </w:r>
             <w:r>
-              <w:t xml:space="preserve">podcast episode. Sent via email with a personal note from Gim.</w:t>
-            </w:r>
-          </w:p>
-        </w:tc>
-      </w:tr>
-      <w:tr>
-        <w:tc>
-          <w:tcPr/>
-          <w:p>
-            <w:pPr>
-              <w:pStyle w:val="Compact"/>
-            </w:pPr>
-            <w:r>
-              <w:rPr>
-                <w:b/>
-                <w:bCs/>
-              </w:rPr>
-              <w:t xml:space="preserve">Key Messages</w:t>
-            </w:r>
-          </w:p>
-        </w:tc>
-        <w:tc>
-          <w:tcPr/>
-          <w:p>
-            <w:pPr>
-              <w:pStyle w:val="Compact"/>
-            </w:pPr>
-            <w:r>
-              <w:t xml:space="preserve">“I’ve done your job. I know what it takes. This campaign exists because I believe in what you can do.”</w:t>
+              <w:t xml:space="preserve">“When was the last time you lost a lead because you hesitated?”</w:t>
+            </w:r>
+          </w:p>
+        </w:tc>
+      </w:tr>
+      <w:tr>
+        <w:tc>
+          <w:tcPr/>
+          <w:p>
+            <w:pPr>
+              <w:pStyle w:val="Compact"/>
+            </w:pPr>
+            <w:r>
+              <w:rPr>
+                <w:b/>
+                <w:bCs/>
+              </w:rPr>
+              <w:t xml:space="preserve">Action</w:t>
+            </w:r>
+          </w:p>
+        </w:tc>
+        <w:tc>
+          <w:tcPr/>
+          <w:p>
+            <w:pPr>
+              <w:pStyle w:val="Compact"/>
+            </w:pPr>
+            <w:r>
+              <w:t xml:space="preserve">Each branch designates a named EDI owner. Commit to 15-minute HLES check cadence.</w:t>
             </w:r>
           </w:p>
         </w:tc>
@@ -1601,25 +1776,13 @@
       </w:r>
     </w:p>
     <w:bookmarkEnd w:id="18"/>
-    <w:bookmarkStart w:id="19" w:name="X135e8df8dbc93717813c897b727a4e7f12a84aa"/>
+    <w:bookmarkStart w:id="19" w:name="Xae459c487057f4c78e3d08caee009f4fcce567b"/>
     <w:p>
       <w:pPr>
         <w:pStyle w:val="Heading3"/>
       </w:pPr>
       <w:r>
-        <w:t xml:space="preserve">Session 2 — Own It: The</w:t>
-      </w:r>
-      <w:r>
-        <w:t xml:space="preserve"> </w:t>
-      </w:r>
-      <w:r>
-        <w:t xml:space="preserve">“Yes We Can”</w:t>
-      </w:r>
-      <w:r>
-        <w:t xml:space="preserve"> </w:t>
-      </w:r>
-      <w:r>
-        <w:t xml:space="preserve">Mentality</w:t>
+        <w:t xml:space="preserve">Session 3 — Outbound Best Practices: Speed to Contact</w:t>
       </w:r>
       <w:r>
         <w:t xml:space="preserve"> </w:t>
@@ -1629,7 +1792,7 @@
           <w:i/>
           <w:iCs/>
         </w:rPr>
-        <w:t xml:space="preserve">(Gim Unfiltered Ep. 1)</w:t>
+        <w:t xml:space="preserve">(Gim Unfiltered Ep. 2)</w:t>
       </w:r>
     </w:p>
     <w:tbl>
@@ -1666,13 +1829,7 @@
               <w:pStyle w:val="Compact"/>
             </w:pPr>
             <w:r>
-              <w:t xml:space="preserve">Instill ownership mindset. Every lead is MY lead, MY revenue, MY business. Dedicated EDI owners, 15-minute HLES checks,</w:t>
-            </w:r>
-            <w:r>
-              <w:t xml:space="preserve"> </w:t>
-            </w:r>
-            <w:r>
-              <w:t xml:space="preserve">“book first, figure out logistics later.”</w:t>
+              <w:t xml:space="preserve">First contact within 30 minutes. Make contact same day. What to do when you can’t get through — call the body shop, call the Rental Management Rep, verify numbers, get alternative contacts.</w:t>
             </w:r>
           </w:p>
         </w:tc>
@@ -1728,7 +1885,7 @@
               <w:pStyle w:val="Compact"/>
             </w:pPr>
             <w:r>
-              <w:t xml:space="preserve">1–2 top-performing Branch Managers</w:t>
+              <w:t xml:space="preserve">Top-performing Branch Manager(s)</w:t>
             </w:r>
           </w:p>
         </w:tc>
@@ -1756,7 +1913,7 @@
               <w:pStyle w:val="Compact"/>
             </w:pPr>
             <w:r>
-              <w:t xml:space="preserve">All Branch Managers</w:t>
+              <w:t xml:space="preserve">All Branch Managers + MAs/MTs</w:t>
             </w:r>
           </w:p>
         </w:tc>
@@ -1784,7 +1941,7 @@
               <w:pStyle w:val="Compact"/>
             </w:pPr>
             <w:r>
-              <w:t xml:space="preserve">Gim Unfiltered podcast episode. Virtual (Microsoft Teams). Recorded.</w:t>
+              <w:t xml:space="preserve">Gim Unfiltered podcast episode. Virtual (Microsoft Teams). One-way broadcast. Recorded.</w:t>
             </w:r>
           </w:p>
         </w:tc>
@@ -1840,47 +1997,7 @@
               <w:pStyle w:val="Compact"/>
             </w:pPr>
             <w:r>
-              <w:t xml:space="preserve">EDI lead ownership checklist, sample daily HLES check routine</w:t>
-            </w:r>
-          </w:p>
-        </w:tc>
-      </w:tr>
-      <w:tr>
-        <w:tc>
-          <w:tcPr/>
-          <w:p>
-            <w:pPr>
-              <w:pStyle w:val="Compact"/>
-            </w:pPr>
-            <w:r>
-              <w:rPr>
-                <w:b/>
-                <w:bCs/>
-              </w:rPr>
-              <w:t xml:space="preserve">Discussion Prompts</w:t>
-            </w:r>
-          </w:p>
-        </w:tc>
-        <w:tc>
-          <w:tcPr/>
-          <w:p>
-            <w:pPr>
-              <w:pStyle w:val="Compact"/>
-            </w:pPr>
-            <w:r>
-              <w:t xml:space="preserve">“What stops you from saying yes?”</w:t>
-            </w:r>
-            <w:r>
-              <w:t xml:space="preserve"> </w:t>
-            </w:r>
-            <w:r>
-              <w:t xml:space="preserve">/</w:t>
-            </w:r>
-            <w:r>
-              <w:t xml:space="preserve"> </w:t>
-            </w:r>
-            <w:r>
-              <w:t xml:space="preserve">“When was the last time you lost a lead because you hesitated?”</w:t>
+              <w:t xml:space="preserve">Outbound call script template, escalation flowchart (can’t reach customer), time-to-contact benchmark data</w:t>
             </w:r>
           </w:p>
         </w:tc>
@@ -1908,7 +2025,7 @@
               <w:pStyle w:val="Compact"/>
             </w:pPr>
             <w:r>
-              <w:t xml:space="preserve">Each branch designates a named EDI owner. Commit to 15-minute HLES check cadence.</w:t>
+              <w:t xml:space="preserve">Branches commit to 30-minute first contact standard. GMs to spot-check TRANSLOG contact timestamps weekly.</w:t>
             </w:r>
           </w:p>
         </w:tc>
@@ -1922,13 +2039,13 @@
       </w:r>
     </w:p>
     <w:bookmarkEnd w:id="19"/>
-    <w:bookmarkStart w:id="20" w:name="Xae459c487057f4c78e3d08caee009f4fcce567b"/>
+    <w:bookmarkStart w:id="20" w:name="Xcd301185cbc51867d4aa2e96b7183cbd50732fb"/>
     <w:p>
       <w:pPr>
         <w:pStyle w:val="Heading3"/>
       </w:pPr>
       <w:r>
-        <w:t xml:space="preserve">Session 3 — Outbound Best Practices: Speed to Contact</w:t>
+        <w:t xml:space="preserve">Session 4 — Inbound Best Practices: Every Call Answered</w:t>
       </w:r>
       <w:r>
         <w:t xml:space="preserve"> </w:t>
@@ -1938,7 +2055,7 @@
           <w:i/>
           <w:iCs/>
         </w:rPr>
-        <w:t xml:space="preserve">(Gim Unfiltered Ep. 2)</w:t>
+        <w:t xml:space="preserve">(Gim Unfiltered Ep. 3)</w:t>
       </w:r>
     </w:p>
     <w:tbl>
@@ -1975,7 +2092,13 @@
               <w:pStyle w:val="Compact"/>
             </w:pPr>
             <w:r>
-              <w:t xml:space="preserve">First contact within 30 minutes. Make contact same day. What to do when you can’t get through — call the body shop, call the Rental Management Rep, verify numbers, get alternative contacts.</w:t>
+              <w:t xml:space="preserve">“Please hold”</w:t>
+            </w:r>
+            <w:r>
+              <w:t xml:space="preserve"> </w:t>
+            </w:r>
+            <w:r>
+              <w:t xml:space="preserve">beats no answer. A missed call is a missed rental. Cover call routing, handling high-volume periods, and what to say when you’re busy.</w:t>
             </w:r>
           </w:p>
         </w:tc>
@@ -2031,7 +2154,7 @@
               <w:pStyle w:val="Compact"/>
             </w:pPr>
             <w:r>
-              <w:t xml:space="preserve">Top-performing Branch Manager(s)</w:t>
+              <w:t xml:space="preserve">Branch Manager spotlight</w:t>
             </w:r>
           </w:p>
         </w:tc>
@@ -2059,7 +2182,7 @@
               <w:pStyle w:val="Compact"/>
             </w:pPr>
             <w:r>
-              <w:t xml:space="preserve">All Branch Managers</w:t>
+              <w:t xml:space="preserve">All Branch Managers + MAs/MTs</w:t>
             </w:r>
           </w:p>
         </w:tc>
@@ -2087,7 +2210,7 @@
               <w:pStyle w:val="Compact"/>
             </w:pPr>
             <w:r>
-              <w:t xml:space="preserve">Gim Unfiltered podcast episode. Virtual (Microsoft Teams). Recorded.</w:t>
+              <w:t xml:space="preserve">Gim Unfiltered podcast episode. Virtual (Microsoft Teams). One-way broadcast. Recorded.</w:t>
             </w:r>
           </w:p>
         </w:tc>
@@ -2143,7 +2266,7 @@
               <w:pStyle w:val="Compact"/>
             </w:pPr>
             <w:r>
-              <w:t xml:space="preserve">Outbound call script template, escalation flowchart (can’t reach customer), time-to-contact benchmark data</w:t>
+              <w:t xml:space="preserve">Inbound call handling guidelines, peak-hour staffing checklist</w:t>
             </w:r>
           </w:p>
         </w:tc>
@@ -2171,7 +2294,19 @@
               <w:pStyle w:val="Compact"/>
             </w:pPr>
             <w:r>
-              <w:t xml:space="preserve">Branches commit to 30-minute first contact standard. GMs to spot-check TRANSLOG contact timestamps weekly.</w:t>
+              <w:t xml:space="preserve">Branches implement</w:t>
+            </w:r>
+            <w:r>
+              <w:t xml:space="preserve"> </w:t>
+            </w:r>
+            <w:r>
+              <w:t xml:space="preserve">“never let it ring out”</w:t>
+            </w:r>
+            <w:r>
+              <w:t xml:space="preserve"> </w:t>
+            </w:r>
+            <w:r>
+              <w:t xml:space="preserve">protocol. GMs review inbound answer rates with branch managers weekly.</w:t>
             </w:r>
           </w:p>
         </w:tc>
@@ -2185,23 +2320,13 @@
       </w:r>
     </w:p>
     <w:bookmarkEnd w:id="20"/>
-    <w:bookmarkStart w:id="21" w:name="Xcd301185cbc51867d4aa2e96b7183cbd50732fb"/>
+    <w:bookmarkStart w:id="21" w:name="X3c7f1f9a8d9051bcd998944fe84eca57dfce3f4"/>
     <w:p>
       <w:pPr>
         <w:pStyle w:val="Heading3"/>
       </w:pPr>
       <w:r>
-        <w:t xml:space="preserve">Session 4 — Inbound Best Practices: Every Call Answered</w:t>
-      </w:r>
-      <w:r>
-        <w:t xml:space="preserve"> </w:t>
-      </w:r>
-      <w:r>
-        <w:rPr>
-          <w:i/>
-          <w:iCs/>
-        </w:rPr>
-        <w:t xml:space="preserve">(Gim Unfiltered Ep. 3)</w:t>
+        <w:t xml:space="preserve">Bonus Episode — Gim’s Journey: From Team Member to VP</w:t>
       </w:r>
     </w:p>
     <w:tbl>
@@ -2238,221 +2363,187 @@
               <w:pStyle w:val="Compact"/>
             </w:pPr>
             <w:r>
-              <w:t xml:space="preserve">“Please hold”</w:t>
+              <w:t xml:space="preserve">Build credibility and connection. Gim shares his personal journey through Hertz — from the ground up to leading operations. Reinforces why this campaign matters to him personally and why he believes in the people doing this work.</w:t>
+            </w:r>
+          </w:p>
+        </w:tc>
+      </w:tr>
+      <w:tr>
+        <w:tc>
+          <w:tcPr/>
+          <w:p>
+            <w:pPr>
+              <w:pStyle w:val="Compact"/>
+            </w:pPr>
+            <w:r>
+              <w:rPr>
+                <w:b/>
+                <w:bCs/>
+              </w:rPr>
+              <w:t xml:space="preserve">Host</w:t>
+            </w:r>
+          </w:p>
+        </w:tc>
+        <w:tc>
+          <w:tcPr/>
+          <w:p>
+            <w:pPr>
+              <w:pStyle w:val="Compact"/>
+            </w:pPr>
+            <w:r>
+              <w:t xml:space="preserve">Gim</w:t>
+            </w:r>
+          </w:p>
+        </w:tc>
+      </w:tr>
+      <w:tr>
+        <w:tc>
+          <w:tcPr/>
+          <w:p>
+            <w:pPr>
+              <w:pStyle w:val="Compact"/>
+            </w:pPr>
+            <w:r>
+              <w:rPr>
+                <w:b/>
+                <w:bCs/>
+              </w:rPr>
+              <w:t xml:space="preserve">Guest</w:t>
+            </w:r>
+          </w:p>
+        </w:tc>
+        <w:tc>
+          <w:tcPr/>
+          <w:p>
+            <w:pPr>
+              <w:pStyle w:val="Compact"/>
+            </w:pPr>
+            <w:r>
+              <w:t xml:space="preserve">None (solo episode)</w:t>
+            </w:r>
+          </w:p>
+        </w:tc>
+      </w:tr>
+      <w:tr>
+        <w:tc>
+          <w:tcPr/>
+          <w:p>
+            <w:pPr>
+              <w:pStyle w:val="Compact"/>
+            </w:pPr>
+            <w:r>
+              <w:rPr>
+                <w:b/>
+                <w:bCs/>
+              </w:rPr>
+              <w:t xml:space="preserve">Format</w:t>
+            </w:r>
+          </w:p>
+        </w:tc>
+        <w:tc>
+          <w:tcPr/>
+          <w:p>
+            <w:pPr>
+              <w:pStyle w:val="Compact"/>
+            </w:pPr>
+            <w:r>
+              <w:t xml:space="preserve">Pre-recorded. Drops between Session 4 and Session 5 — by this point the audience is engaged and this deepens the personal connection mid-series.</w:t>
+            </w:r>
+          </w:p>
+        </w:tc>
+      </w:tr>
+      <w:tr>
+        <w:tc>
+          <w:tcPr/>
+          <w:p>
+            <w:pPr>
+              <w:pStyle w:val="Compact"/>
+            </w:pPr>
+            <w:r>
+              <w:rPr>
+                <w:b/>
+                <w:bCs/>
+              </w:rPr>
+              <w:t xml:space="preserve">Duration</w:t>
+            </w:r>
+          </w:p>
+        </w:tc>
+        <w:tc>
+          <w:tcPr/>
+          <w:p>
+            <w:pPr>
+              <w:pStyle w:val="Compact"/>
+            </w:pPr>
+            <w:r>
+              <w:t xml:space="preserve">15–20 minutes</w:t>
+            </w:r>
+          </w:p>
+        </w:tc>
+      </w:tr>
+      <w:tr>
+        <w:tc>
+          <w:tcPr/>
+          <w:p>
+            <w:pPr>
+              <w:pStyle w:val="Compact"/>
+            </w:pPr>
+            <w:r>
+              <w:rPr>
+                <w:b/>
+                <w:bCs/>
+              </w:rPr>
+              <w:t xml:space="preserve">Distribution</w:t>
+            </w:r>
+          </w:p>
+        </w:tc>
+        <w:tc>
+          <w:tcPr/>
+          <w:p>
+            <w:pPr>
+              <w:pStyle w:val="Compact"/>
+            </w:pPr>
+            <w:r>
+              <w:t xml:space="preserve">Packaged as a</w:t>
             </w:r>
             <w:r>
               <w:t xml:space="preserve"> </w:t>
             </w:r>
             <w:r>
-              <w:t xml:space="preserve">beats no answer. A missed call is a missed rental. Cover call routing, handling high-volume periods, and what to say when you’re busy.</w:t>
-            </w:r>
-          </w:p>
-        </w:tc>
-      </w:tr>
-      <w:tr>
-        <w:tc>
-          <w:tcPr/>
-          <w:p>
-            <w:pPr>
-              <w:pStyle w:val="Compact"/>
-            </w:pPr>
-            <w:r>
-              <w:rPr>
-                <w:b/>
-                <w:bCs/>
-              </w:rPr>
-              <w:t xml:space="preserve">Host</w:t>
-            </w:r>
-          </w:p>
-        </w:tc>
-        <w:tc>
-          <w:tcPr/>
-          <w:p>
-            <w:pPr>
-              <w:pStyle w:val="Compact"/>
-            </w:pPr>
-            <w:r>
-              <w:t xml:space="preserve">Gim</w:t>
-            </w:r>
-          </w:p>
-        </w:tc>
-      </w:tr>
-      <w:tr>
-        <w:tc>
-          <w:tcPr/>
-          <w:p>
-            <w:pPr>
-              <w:pStyle w:val="Compact"/>
-            </w:pPr>
-            <w:r>
-              <w:rPr>
-                <w:b/>
-                <w:bCs/>
-              </w:rPr>
-              <w:t xml:space="preserve">Guest</w:t>
-            </w:r>
-          </w:p>
-        </w:tc>
-        <w:tc>
-          <w:tcPr/>
-          <w:p>
-            <w:pPr>
-              <w:pStyle w:val="Compact"/>
-            </w:pPr>
-            <w:r>
-              <w:t xml:space="preserve">Branch Manager spotlight</w:t>
-            </w:r>
-          </w:p>
-        </w:tc>
-      </w:tr>
-      <w:tr>
-        <w:tc>
-          <w:tcPr/>
-          <w:p>
-            <w:pPr>
-              <w:pStyle w:val="Compact"/>
-            </w:pPr>
-            <w:r>
-              <w:rPr>
-                <w:b/>
-                <w:bCs/>
-              </w:rPr>
-              <w:t xml:space="preserve">Audience</w:t>
-            </w:r>
-          </w:p>
-        </w:tc>
-        <w:tc>
-          <w:tcPr/>
-          <w:p>
-            <w:pPr>
-              <w:pStyle w:val="Compact"/>
-            </w:pPr>
-            <w:r>
-              <w:t xml:space="preserve">All Branch Managers</w:t>
-            </w:r>
-          </w:p>
-        </w:tc>
-      </w:tr>
-      <w:tr>
-        <w:tc>
-          <w:tcPr/>
-          <w:p>
-            <w:pPr>
-              <w:pStyle w:val="Compact"/>
-            </w:pPr>
-            <w:r>
-              <w:rPr>
-                <w:b/>
-                <w:bCs/>
-              </w:rPr>
-              <w:t xml:space="preserve">Format</w:t>
-            </w:r>
-          </w:p>
-        </w:tc>
-        <w:tc>
-          <w:tcPr/>
-          <w:p>
-            <w:pPr>
-              <w:pStyle w:val="Compact"/>
-            </w:pPr>
-            <w:r>
-              <w:t xml:space="preserve">Gim Unfiltered podcast episode. Virtual (Microsoft Teams). Recorded.</w:t>
-            </w:r>
-          </w:p>
-        </w:tc>
-      </w:tr>
-      <w:tr>
-        <w:tc>
-          <w:tcPr/>
-          <w:p>
-            <w:pPr>
-              <w:pStyle w:val="Compact"/>
-            </w:pPr>
-            <w:r>
-              <w:rPr>
-                <w:b/>
-                <w:bCs/>
-              </w:rPr>
-              <w:t xml:space="preserve">Duration</w:t>
-            </w:r>
-          </w:p>
-        </w:tc>
-        <w:tc>
-          <w:tcPr/>
-          <w:p>
-            <w:pPr>
-              <w:pStyle w:val="Compact"/>
-            </w:pPr>
-            <w:r>
-              <w:t xml:space="preserve">30 minutes</w:t>
-            </w:r>
-          </w:p>
-        </w:tc>
-      </w:tr>
-      <w:tr>
-        <w:tc>
-          <w:tcPr/>
-          <w:p>
-            <w:pPr>
-              <w:pStyle w:val="Compact"/>
-            </w:pPr>
-            <w:r>
-              <w:rPr>
-                <w:b/>
-                <w:bCs/>
-              </w:rPr>
-              <w:t xml:space="preserve">Artefacts</w:t>
-            </w:r>
-          </w:p>
-        </w:tc>
-        <w:tc>
-          <w:tcPr/>
-          <w:p>
-            <w:pPr>
-              <w:pStyle w:val="Compact"/>
-            </w:pPr>
-            <w:r>
-              <w:t xml:space="preserve">Inbound call handling guidelines, peak-hour staffing checklist</w:t>
-            </w:r>
-          </w:p>
-        </w:tc>
-      </w:tr>
-      <w:tr>
-        <w:tc>
-          <w:tcPr/>
-          <w:p>
-            <w:pPr>
-              <w:pStyle w:val="Compact"/>
-            </w:pPr>
-            <w:r>
-              <w:rPr>
-                <w:b/>
-                <w:bCs/>
-              </w:rPr>
-              <w:t xml:space="preserve">Action</w:t>
-            </w:r>
-          </w:p>
-        </w:tc>
-        <w:tc>
-          <w:tcPr/>
-          <w:p>
-            <w:pPr>
-              <w:pStyle w:val="Compact"/>
-            </w:pPr>
-            <w:r>
-              <w:t xml:space="preserve">Branches implement</w:t>
+              <w:t xml:space="preserve">“Gim Unfiltered”</w:t>
             </w:r>
             <w:r>
               <w:t xml:space="preserve"> </w:t>
             </w:r>
             <w:r>
-              <w:t xml:space="preserve">“never let it ring out”</w:t>
-            </w:r>
-            <w:r>
-              <w:t xml:space="preserve"> </w:t>
-            </w:r>
-            <w:r>
-              <w:t xml:space="preserve">protocol. GMs review inbound answer rates with branch managers weekly.</w:t>
+              <w:t xml:space="preserve">podcast episode. Sent via email with a personal note from Gim. Posted on Viva Engage.</w:t>
+            </w:r>
+          </w:p>
+        </w:tc>
+      </w:tr>
+      <w:tr>
+        <w:tc>
+          <w:tcPr/>
+          <w:p>
+            <w:pPr>
+              <w:pStyle w:val="Compact"/>
+            </w:pPr>
+            <w:r>
+              <w:rPr>
+                <w:b/>
+                <w:bCs/>
+              </w:rPr>
+              <w:t xml:space="preserve">Key Messages</w:t>
+            </w:r>
+          </w:p>
+        </w:tc>
+        <w:tc>
+          <w:tcPr/>
+          <w:p>
+            <w:pPr>
+              <w:pStyle w:val="Compact"/>
+            </w:pPr>
+            <w:r>
+              <w:t xml:space="preserve">“I’ve done your job. I know what it takes. This campaign exists because I believe in what you can do.”</w:t>
             </w:r>
           </w:p>
         </w:tc>
@@ -2603,7 +2694,7 @@
               <w:pStyle w:val="Compact"/>
             </w:pPr>
             <w:r>
-              <w:t xml:space="preserve">All Branch Managers + General Managers</w:t>
+              <w:t xml:space="preserve">All Branch Managers + MAs/MTs</w:t>
             </w:r>
           </w:p>
         </w:tc>
@@ -2631,7 +2722,7 @@
               <w:pStyle w:val="Compact"/>
             </w:pPr>
             <w:r>
-              <w:t xml:space="preserve">Gim Unfiltered podcast episode. Virtual (Microsoft Teams). Recorded.</w:t>
+              <w:t xml:space="preserve">Gim Unfiltered podcast episode. Virtual (Microsoft Teams). One-way broadcast. Recorded.</w:t>
             </w:r>
           </w:p>
         </w:tc>
@@ -2898,7 +2989,7 @@
               <w:pStyle w:val="Compact"/>
             </w:pPr>
             <w:r>
-              <w:t xml:space="preserve">All Branch Managers</w:t>
+              <w:t xml:space="preserve">All Branch Managers + MAs/MTs</w:t>
             </w:r>
           </w:p>
         </w:tc>
@@ -2926,7 +3017,7 @@
               <w:pStyle w:val="Compact"/>
             </w:pPr>
             <w:r>
-              <w:t xml:space="preserve">Gim Unfiltered podcast episode. Virtual (Microsoft Teams). Recorded.</w:t>
+              <w:t xml:space="preserve">Gim Unfiltered podcast episode. Virtual (Microsoft Teams). One-way broadcast. Recorded.</w:t>
             </w:r>
           </w:p>
         </w:tc>
@@ -3133,7 +3224,7 @@
               <w:pStyle w:val="Compact"/>
             </w:pPr>
             <w:r>
-              <w:t xml:space="preserve">All Branch Managers + General Managers</w:t>
+              <w:t xml:space="preserve">All Branch Managers + MAs/MTs</w:t>
             </w:r>
           </w:p>
         </w:tc>
@@ -3161,7 +3252,7 @@
               <w:pStyle w:val="Compact"/>
             </w:pPr>
             <w:r>
-              <w:t xml:space="preserve">Gim Unfiltered podcast episode. Virtual (Microsoft Teams). Recorded.</w:t>
+              <w:t xml:space="preserve">Gim Unfiltered podcast episode. Virtual (Microsoft Teams). One-way broadcast. Recorded.</w:t>
             </w:r>
           </w:p>
         </w:tc>
@@ -3396,7 +3487,7 @@
               <w:pStyle w:val="Compact"/>
             </w:pPr>
             <w:r>
-              <w:t xml:space="preserve">All General Managers + All Branch Managers</w:t>
+              <w:t xml:space="preserve">All Branch Managers + MAs/MTs</w:t>
             </w:r>
           </w:p>
         </w:tc>
@@ -3424,7 +3515,7 @@
               <w:pStyle w:val="Compact"/>
             </w:pPr>
             <w:r>
-              <w:t xml:space="preserve">Gim Unfiltered podcast episode. Virtual (Microsoft Teams). Recorded.</w:t>
+              <w:t xml:space="preserve">Gim Unfiltered podcast episode. Virtual (Microsoft Teams). One-way broadcast. Recorded.</w:t>
             </w:r>
           </w:p>
         </w:tc>
@@ -3523,7 +3614,7 @@
     </w:p>
     <w:bookmarkEnd w:id="25"/>
     <w:bookmarkEnd w:id="26"/>
-    <w:bookmarkStart w:id="30" w:name="production-distribution"/>
+    <w:bookmarkStart w:id="33" w:name="production-distribution"/>
     <w:p>
       <w:pPr>
         <w:pStyle w:val="Heading2"/>
@@ -3649,7 +3740,23 @@
         </w:numPr>
       </w:pPr>
       <w:r>
-        <w:t xml:space="preserve">Packaged episodes are distributed so that anyone who missed the live session still receives the content</w:t>
+        <w:t xml:space="preserve">Packaged episodes uploaded to</w:t>
+      </w:r>
+      <w:r>
+        <w:t xml:space="preserve"> </w:t>
+      </w:r>
+      <w:r>
+        <w:rPr>
+          <w:b/>
+          <w:bCs/>
+        </w:rPr>
+        <w:t xml:space="preserve">OneDrive</w:t>
+      </w:r>
+      <w:r>
+        <w:t xml:space="preserve"> </w:t>
+      </w:r>
+      <w:r>
+        <w:t xml:space="preserve">for on-demand access</w:t>
       </w:r>
     </w:p>
     <w:bookmarkEnd w:id="27"/>
@@ -3671,17 +3778,23 @@
         </w:numPr>
       </w:pPr>
       <w:r>
+        <w:t xml:space="preserve">Only</w:t>
+      </w:r>
+      <w:r>
+        <w:t xml:space="preserve"> </w:t>
+      </w:r>
+      <w:r>
         <w:rPr>
           <w:b/>
           <w:bCs/>
         </w:rPr>
-        <w:t xml:space="preserve">Pre-session teaser</w:t>
-      </w:r>
-      <w:r>
-        <w:t xml:space="preserve"> </w:t>
-      </w:r>
-      <w:r>
-        <w:t xml:space="preserve">sent before each episode to build anticipation</w:t>
+        <w:t xml:space="preserve">3 sessions foreshadowed at a time</w:t>
+      </w:r>
+      <w:r>
+        <w:t xml:space="preserve"> </w:t>
+      </w:r>
+      <w:r>
+        <w:t xml:space="preserve">(not the full series) — keeps anticipation fresh and allows for timing adjustments</w:t>
       </w:r>
     </w:p>
     <w:p>
@@ -3697,13 +3810,13 @@
           <w:b/>
           <w:bCs/>
         </w:rPr>
-        <w:t xml:space="preserve">Next episode tease</w:t>
-      </w:r>
-      <w:r>
-        <w:t xml:space="preserve"> </w:t>
-      </w:r>
-      <w:r>
-        <w:t xml:space="preserve">at the end of each session — the full series is not announced upfront; each episode reveals only what’s coming next</w:t>
+        <w:t xml:space="preserve">Monthly touch base between Gim and Alicia</w:t>
+      </w:r>
+      <w:r>
+        <w:t xml:space="preserve"> </w:t>
+      </w:r>
+      <w:r>
+        <w:t xml:space="preserve">to review pacing, adjust upcoming session timing, and confirm guest availability</w:t>
       </w:r>
     </w:p>
     <w:p>
@@ -3731,17 +3844,25 @@
         <w:t xml:space="preserve"> </w:t>
       </w:r>
       <w:r>
-        <w:t xml:space="preserve">and printed/posted at branches</w:t>
+        <w:t xml:space="preserve">and posted at branches (HR boards / break rooms)</w:t>
       </w:r>
     </w:p>
     <w:bookmarkEnd w:id="28"/>
-    <w:bookmarkStart w:id="29" w:name="continuous-push"/>
+    <w:bookmarkStart w:id="29" w:name="reminder-campaign-per-session"/>
     <w:p>
       <w:pPr>
         <w:pStyle w:val="Heading3"/>
       </w:pPr>
       <w:r>
-        <w:t xml:space="preserve">Continuous Push</w:t>
+        <w:t xml:space="preserve">Reminder Campaign (Per Session)</w:t>
+      </w:r>
+    </w:p>
+    <w:p>
+      <w:pPr>
+        <w:pStyle w:val="FirstParagraph"/>
+      </w:pPr>
+      <w:r>
+        <w:t xml:space="preserve">Each session follows a 3-touch notification cadence:</w:t>
       </w:r>
     </w:p>
     <w:p>
@@ -3753,7 +3874,17 @@
         </w:numPr>
       </w:pPr>
       <w:r>
-        <w:t xml:space="preserve">The campaign does not rely on live attendance alone. Every session is repackaged and pushed out, ensuring the content reaches every branch manager regardless of whether they attended live</w:t>
+        <w:rPr>
+          <w:b/>
+          <w:bCs/>
+        </w:rPr>
+        <w:t xml:space="preserve">Calendar invite</w:t>
+      </w:r>
+      <w:r>
+        <w:t xml:space="preserve"> </w:t>
+      </w:r>
+      <w:r>
+        <w:t xml:space="preserve">sent with session details and raffle mention</w:t>
       </w:r>
     </w:p>
     <w:p>
@@ -3765,7 +3896,17 @@
         </w:numPr>
       </w:pPr>
       <w:r>
-        <w:t xml:space="preserve">New starters can catch up on the back catalogue of episodes</w:t>
+        <w:rPr>
+          <w:b/>
+          <w:bCs/>
+        </w:rPr>
+        <w:t xml:space="preserve">Thumbnail update</w:t>
+      </w:r>
+      <w:r>
+        <w:t xml:space="preserve"> </w:t>
+      </w:r>
+      <w:r>
+        <w:t xml:space="preserve">— calendar invite updated with episode artwork (triggers a second notification)</w:t>
       </w:r>
     </w:p>
     <w:p>
@@ -3777,6 +3918,178 @@
         </w:numPr>
       </w:pPr>
       <w:r>
+        <w:rPr>
+          <w:b/>
+          <w:bCs/>
+        </w:rPr>
+        <w:t xml:space="preserve">Pre-session reminder</w:t>
+      </w:r>
+      <w:r>
+        <w:t xml:space="preserve"> </w:t>
+      </w:r>
+      <w:r>
+        <w:t xml:space="preserve">—</w:t>
+      </w:r>
+      <w:r>
+        <w:t xml:space="preserve"> </w:t>
+      </w:r>
+      <w:r>
+        <w:t xml:space="preserve">“tune in”</w:t>
+      </w:r>
+      <w:r>
+        <w:t xml:space="preserve"> </w:t>
+      </w:r>
+      <w:r>
+        <w:t xml:space="preserve">message sent the day of or day before</w:t>
+      </w:r>
+    </w:p>
+    <w:bookmarkEnd w:id="29"/>
+    <w:bookmarkStart w:id="30" w:name="post-session-follow-up"/>
+    <w:p>
+      <w:pPr>
+        <w:pStyle w:val="Heading3"/>
+      </w:pPr>
+      <w:r>
+        <w:t xml:space="preserve">Post-Session Follow-Up</w:t>
+      </w:r>
+    </w:p>
+    <w:p>
+      <w:pPr>
+        <w:pStyle w:val="Compact"/>
+        <w:numPr>
+          <w:ilvl w:val="0"/>
+          <w:numId w:val="1006"/>
+        </w:numPr>
+      </w:pPr>
+      <w:r>
+        <w:rPr>
+          <w:b/>
+          <w:bCs/>
+        </w:rPr>
+        <w:t xml:space="preserve">AI-generated casual summary</w:t>
+      </w:r>
+      <w:r>
+        <w:t xml:space="preserve"> </w:t>
+      </w:r>
+      <w:r>
+        <w:t xml:space="preserve">sent to all participants after each episode — written in a colloquial, friendly tone (not executive bullet points). Recaps the key takeaways in a way that feels like a mate telling you what you missed.</w:t>
+      </w:r>
+    </w:p>
+    <w:p>
+      <w:pPr>
+        <w:pStyle w:val="Compact"/>
+        <w:numPr>
+          <w:ilvl w:val="0"/>
+          <w:numId w:val="1006"/>
+        </w:numPr>
+      </w:pPr>
+      <w:r>
+        <w:rPr>
+          <w:b/>
+          <w:bCs/>
+        </w:rPr>
+        <w:t xml:space="preserve">Viva Engage post</w:t>
+      </w:r>
+      <w:r>
+        <w:t xml:space="preserve"> </w:t>
+      </w:r>
+      <w:r>
+        <w:t xml:space="preserve">when the podcast episode goes live on OneDrive — opens a chat thread for feedback, reactions, and momentum between sessions</w:t>
+      </w:r>
+    </w:p>
+    <w:bookmarkEnd w:id="30"/>
+    <w:bookmarkStart w:id="31" w:name="attendance-incentive"/>
+    <w:p>
+      <w:pPr>
+        <w:pStyle w:val="Heading3"/>
+      </w:pPr>
+      <w:r>
+        <w:t xml:space="preserve">Attendance Incentive</w:t>
+      </w:r>
+    </w:p>
+    <w:p>
+      <w:pPr>
+        <w:pStyle w:val="Compact"/>
+        <w:numPr>
+          <w:ilvl w:val="0"/>
+          <w:numId w:val="1007"/>
+        </w:numPr>
+      </w:pPr>
+      <w:r>
+        <w:t xml:space="preserve">Attendees (live or recording viewers) are</w:t>
+      </w:r>
+      <w:r>
+        <w:t xml:space="preserve"> </w:t>
+      </w:r>
+      <w:r>
+        <w:rPr>
+          <w:b/>
+          <w:bCs/>
+        </w:rPr>
+        <w:t xml:space="preserve">entered into a raffle to win Award Points</w:t>
+      </w:r>
+      <w:r>
+        <w:t xml:space="preserve"> </w:t>
+      </w:r>
+      <w:r>
+        <w:t xml:space="preserve">(gift card equivalent)</w:t>
+      </w:r>
+    </w:p>
+    <w:p>
+      <w:pPr>
+        <w:pStyle w:val="Compact"/>
+        <w:numPr>
+          <w:ilvl w:val="0"/>
+          <w:numId w:val="1007"/>
+        </w:numPr>
+      </w:pPr>
+      <w:r>
+        <w:t xml:space="preserve">Communicated in the calendar invite for each session</w:t>
+      </w:r>
+    </w:p>
+    <w:bookmarkEnd w:id="31"/>
+    <w:bookmarkStart w:id="32" w:name="continuous-push"/>
+    <w:p>
+      <w:pPr>
+        <w:pStyle w:val="Heading3"/>
+      </w:pPr>
+      <w:r>
+        <w:t xml:space="preserve">Continuous Push</w:t>
+      </w:r>
+    </w:p>
+    <w:p>
+      <w:pPr>
+        <w:pStyle w:val="Compact"/>
+        <w:numPr>
+          <w:ilvl w:val="0"/>
+          <w:numId w:val="1008"/>
+        </w:numPr>
+      </w:pPr>
+      <w:r>
+        <w:t xml:space="preserve">The campaign does not rely on live attendance alone. Every session is repackaged and pushed out, ensuring the content reaches every branch manager regardless of whether they attended live</w:t>
+      </w:r>
+    </w:p>
+    <w:p>
+      <w:pPr>
+        <w:pStyle w:val="Compact"/>
+        <w:numPr>
+          <w:ilvl w:val="0"/>
+          <w:numId w:val="1008"/>
+        </w:numPr>
+      </w:pPr>
+      <w:r>
+        <w:t xml:space="preserve">New starters can catch up on the back catalogue of episodes</w:t>
+      </w:r>
+    </w:p>
+    <w:p>
+      <w:pPr>
+        <w:pStyle w:val="Compact"/>
+        <w:numPr>
+          <w:ilvl w:val="0"/>
+          <w:numId w:val="1008"/>
+        </w:numPr>
+      </w:pPr>
+      <w:r>
         <w:t xml:space="preserve">This creates a</w:t>
       </w:r>
       <w:r>
@@ -3803,15 +4116,15 @@
         </w:pict>
       </w:r>
     </w:p>
-    <w:bookmarkEnd w:id="29"/>
-    <w:bookmarkEnd w:id="30"/>
-    <w:bookmarkStart w:id="31" w:name="cascade-sessions-gm-led"/>
+    <w:bookmarkEnd w:id="32"/>
+    <w:bookmarkEnd w:id="33"/>
+    <w:bookmarkStart w:id="34" w:name="Xa4274e5afb1958cc7171462ed61856672f10bf6"/>
     <w:p>
       <w:pPr>
         <w:pStyle w:val="Heading2"/>
       </w:pPr>
       <w:r>
-        <w:t xml:space="preserve">6. Cascade Sessions (GM-Led)</w:t>
+        <w:t xml:space="preserve">6. AM/GM Monthly Cadence (Separate from Campaign)</w:t>
       </w:r>
     </w:p>
     <w:p>
@@ -3819,7 +4132,7 @@
         <w:pStyle w:val="FirstParagraph"/>
       </w:pPr>
       <w:r>
-        <w:t xml:space="preserve">In addition to the central sessions above, select topics will be packaged for</w:t>
+        <w:t xml:space="preserve">General Managers and Area Managers are</w:t>
       </w:r>
       <w:r>
         <w:t xml:space="preserve"> </w:t>
@@ -3829,273 +4142,85 @@
           <w:b/>
           <w:bCs/>
         </w:rPr>
-        <w:t xml:space="preserve">General Managers to re-deliver to their branch managers</w:t>
-      </w:r>
-      <w:r>
-        <w:t xml:space="preserve"> </w:t>
-      </w:r>
-      <w:r>
-        <w:t xml:space="preserve">in smaller, regional groups. This extends the reach of the campaign and reinforces accountability at the GM level.</w:t>
-      </w:r>
-    </w:p>
-    <w:tbl>
-      <w:tblPr>
-        <w:tblStyle w:val="Table"/>
-        <w:tblW w:type="pct" w:w="5000"/>
-        <w:tblLayout w:type="fixed"/>
-        <w:tblLook w:firstRow="1" w:lastRow="0" w:firstColumn="0" w:lastColumn="0" w:noHBand="0" w:noVBand="0" w:val="0020"/>
-      </w:tblPr>
-      <w:tblGrid>
-        <w:gridCol w:w="1584"/>
-        <w:gridCol w:w="1584"/>
-        <w:gridCol w:w="1584"/>
-        <w:gridCol w:w="1584"/>
-        <w:gridCol w:w="1584"/>
-      </w:tblGrid>
-      <w:tr>
-        <w:trPr>
-          <w:tblHeader w:val="on"/>
-        </w:trPr>
-        <w:tc>
-          <w:tcPr/>
-          <w:p>
-            <w:pPr>
-              <w:pStyle w:val="Compact"/>
-            </w:pPr>
-            <w:r>
-              <w:t xml:space="preserve">Cascade Session</w:t>
-            </w:r>
-          </w:p>
-        </w:tc>
-        <w:tc>
-          <w:tcPr/>
-          <w:p>
-            <w:pPr>
-              <w:pStyle w:val="Compact"/>
-            </w:pPr>
-            <w:r>
-              <w:t xml:space="preserve">Based On</w:t>
-            </w:r>
-          </w:p>
-        </w:tc>
-        <w:tc>
-          <w:tcPr/>
-          <w:p>
-            <w:pPr>
-              <w:pStyle w:val="Compact"/>
-            </w:pPr>
-            <w:r>
-              <w:t xml:space="preserve">Led By</w:t>
-            </w:r>
-          </w:p>
-        </w:tc>
-        <w:tc>
-          <w:tcPr/>
-          <w:p>
-            <w:pPr>
-              <w:pStyle w:val="Compact"/>
-            </w:pPr>
-            <w:r>
-              <w:t xml:space="preserve">Audience</w:t>
-            </w:r>
-          </w:p>
-        </w:tc>
-        <w:tc>
-          <w:tcPr/>
-          <w:p>
-            <w:pPr>
-              <w:pStyle w:val="Compact"/>
-            </w:pPr>
-            <w:r>
-              <w:t xml:space="preserve">Format</w:t>
-            </w:r>
-          </w:p>
-        </w:tc>
-      </w:tr>
-      <w:tr>
-        <w:tc>
-          <w:tcPr/>
-          <w:p>
-            <w:pPr>
-              <w:pStyle w:val="Compact"/>
-            </w:pPr>
-            <w:r>
-              <w:t xml:space="preserve">“Own It”</w:t>
-            </w:r>
-            <w:r>
-              <w:t xml:space="preserve"> </w:t>
-            </w:r>
-            <w:r>
-              <w:t xml:space="preserve">Team Briefing</w:t>
-            </w:r>
-          </w:p>
-        </w:tc>
-        <w:tc>
-          <w:tcPr/>
-          <w:p>
-            <w:pPr>
-              <w:pStyle w:val="Compact"/>
-            </w:pPr>
-            <w:r>
-              <w:t xml:space="preserve">Session 2</w:t>
-            </w:r>
-          </w:p>
-        </w:tc>
-        <w:tc>
-          <w:tcPr/>
-          <w:p>
-            <w:pPr>
-              <w:pStyle w:val="Compact"/>
-            </w:pPr>
-            <w:r>
-              <w:t xml:space="preserve">GM</w:t>
-            </w:r>
-          </w:p>
-        </w:tc>
-        <w:tc>
-          <w:tcPr/>
-          <w:p>
-            <w:pPr>
-              <w:pStyle w:val="Compact"/>
-            </w:pPr>
-            <w:r>
-              <w:t xml:space="preserve">Branch Managers in region</w:t>
-            </w:r>
-          </w:p>
-        </w:tc>
-        <w:tc>
-          <w:tcPr/>
-          <w:p>
-            <w:pPr>
-              <w:pStyle w:val="Compact"/>
-            </w:pPr>
-            <w:r>
-              <w:t xml:space="preserve">30-min discussion using provided talking points</w:t>
-            </w:r>
-          </w:p>
-        </w:tc>
-      </w:tr>
-      <w:tr>
-        <w:tc>
-          <w:tcPr/>
-          <w:p>
-            <w:pPr>
-              <w:pStyle w:val="Compact"/>
-            </w:pPr>
-            <w:r>
-              <w:t xml:space="preserve">Outbound Call Practice</w:t>
-            </w:r>
-          </w:p>
-        </w:tc>
-        <w:tc>
-          <w:tcPr/>
-          <w:p>
-            <w:pPr>
-              <w:pStyle w:val="Compact"/>
-            </w:pPr>
-            <w:r>
-              <w:t xml:space="preserve">Session 3</w:t>
-            </w:r>
-          </w:p>
-        </w:tc>
-        <w:tc>
-          <w:tcPr/>
-          <w:p>
-            <w:pPr>
-              <w:pStyle w:val="Compact"/>
-            </w:pPr>
-            <w:r>
-              <w:t xml:space="preserve">GM</w:t>
-            </w:r>
-          </w:p>
-        </w:tc>
-        <w:tc>
-          <w:tcPr/>
-          <w:p>
-            <w:pPr>
-              <w:pStyle w:val="Compact"/>
-            </w:pPr>
-            <w:r>
-              <w:t xml:space="preserve">Branch Managers in region</w:t>
-            </w:r>
-          </w:p>
-        </w:tc>
-        <w:tc>
-          <w:tcPr/>
-          <w:p>
-            <w:pPr>
-              <w:pStyle w:val="Compact"/>
-            </w:pPr>
-            <w:r>
-              <w:t xml:space="preserve">30-min role-play and practice session</w:t>
-            </w:r>
-          </w:p>
-        </w:tc>
-      </w:tr>
-      <w:tr>
-        <w:tc>
-          <w:tcPr/>
-          <w:p>
-            <w:pPr>
-              <w:pStyle w:val="Compact"/>
-            </w:pPr>
-            <w:r>
-              <w:t xml:space="preserve">Weekly Leads Review (ongoing)</w:t>
-            </w:r>
-          </w:p>
-        </w:tc>
-        <w:tc>
-          <w:tcPr/>
-          <w:p>
-            <w:pPr>
-              <w:pStyle w:val="Compact"/>
-            </w:pPr>
-            <w:r>
-              <w:t xml:space="preserve">Session 8</w:t>
-            </w:r>
-          </w:p>
-        </w:tc>
-        <w:tc>
-          <w:tcPr/>
-          <w:p>
-            <w:pPr>
-              <w:pStyle w:val="Compact"/>
-            </w:pPr>
-            <w:r>
-              <w:t xml:space="preserve">GM</w:t>
-            </w:r>
-          </w:p>
-        </w:tc>
-        <w:tc>
-          <w:tcPr/>
-          <w:p>
-            <w:pPr>
-              <w:pStyle w:val="Compact"/>
-            </w:pPr>
-            <w:r>
-              <w:t xml:space="preserve">Each Branch Manager 1:1</w:t>
-            </w:r>
-          </w:p>
-        </w:tc>
-        <w:tc>
-          <w:tcPr/>
-          <w:p>
-            <w:pPr>
-              <w:pStyle w:val="Compact"/>
-            </w:pPr>
-            <w:r>
-              <w:t xml:space="preserve">30-min weekly recurring meeting</w:t>
-            </w:r>
-          </w:p>
-        </w:tc>
-      </w:tr>
-    </w:tbl>
-    <w:p>
-      <w:pPr>
-        <w:pStyle w:val="BodyText"/>
-      </w:pPr>
-      <w:r>
-        <w:t xml:space="preserve">GMs will be provided with facilitation guides and talking points for each cascade session.</w:t>
+        <w:t xml:space="preserve">not part of the session audience</w:t>
+      </w:r>
+      <w:r>
+        <w:t xml:space="preserve"> </w:t>
+      </w:r>
+      <w:r>
+        <w:t xml:space="preserve">for this campaign. Instead, Gim holds a</w:t>
+      </w:r>
+      <w:r>
+        <w:t xml:space="preserve"> </w:t>
+      </w:r>
+      <w:r>
+        <w:rPr>
+          <w:b/>
+          <w:bCs/>
+        </w:rPr>
+        <w:t xml:space="preserve">separate monthly call with AMs and GMs</w:t>
+      </w:r>
+      <w:r>
+        <w:t xml:space="preserve"> </w:t>
+      </w:r>
+      <w:r>
+        <w:t xml:space="preserve">to:</w:t>
+      </w:r>
+    </w:p>
+    <w:p>
+      <w:pPr>
+        <w:pStyle w:val="Compact"/>
+        <w:numPr>
+          <w:ilvl w:val="0"/>
+          <w:numId w:val="1009"/>
+        </w:numPr>
+      </w:pPr>
+      <w:r>
+        <w:t xml:space="preserve">Share campaign progress and key themes from recent episodes</w:t>
+      </w:r>
+    </w:p>
+    <w:p>
+      <w:pPr>
+        <w:pStyle w:val="Compact"/>
+        <w:numPr>
+          <w:ilvl w:val="0"/>
+          <w:numId w:val="1009"/>
+        </w:numPr>
+      </w:pPr>
+      <w:r>
+        <w:t xml:space="preserve">Discuss questions and concerns bubbled up from the branch-level sessions</w:t>
+      </w:r>
+    </w:p>
+    <w:p>
+      <w:pPr>
+        <w:pStyle w:val="Compact"/>
+        <w:numPr>
+          <w:ilvl w:val="0"/>
+          <w:numId w:val="1009"/>
+        </w:numPr>
+      </w:pPr>
+      <w:r>
+        <w:t xml:space="preserve">Align on strategic priorities and regional follow-up actions</w:t>
+      </w:r>
+    </w:p>
+    <w:p>
+      <w:pPr>
+        <w:pStyle w:val="Compact"/>
+        <w:numPr>
+          <w:ilvl w:val="0"/>
+          <w:numId w:val="1009"/>
+        </w:numPr>
+      </w:pPr>
+      <w:r>
+        <w:t xml:space="preserve">Review conversion performance at the GM/region level</w:t>
+      </w:r>
+    </w:p>
+    <w:p>
+      <w:pPr>
+        <w:pStyle w:val="FirstParagraph"/>
+      </w:pPr>
+      <w:r>
+        <w:t xml:space="preserve">This separation keeps the campaign sessions focused and tight (30 minutes, one-way broadcast) while giving GMs and AMs a dedicated forum for two-way discussion with Gim.</w:t>
       </w:r>
     </w:p>
     <w:p>
@@ -4105,8 +4230,8 @@
         </w:pict>
       </w:r>
     </w:p>
-    <w:bookmarkEnd w:id="31"/>
-    <w:bookmarkStart w:id="32" w:name="campaign-calendar-overview"/>
+    <w:bookmarkEnd w:id="34"/>
+    <w:bookmarkStart w:id="35" w:name="campaign-calendar-overview"/>
     <w:p>
       <w:pPr>
         <w:pStyle w:val="Heading2"/>
@@ -4220,7 +4345,7 @@
               <w:pStyle w:val="Compact"/>
             </w:pPr>
             <w:r>
-              <w:t xml:space="preserve">Tue 4 Mar</w:t>
+              <w:t xml:space="preserve">Wed4 Mar</w:t>
             </w:r>
           </w:p>
         </w:tc>
@@ -4253,7 +4378,7 @@
               <w:pStyle w:val="Compact"/>
             </w:pPr>
             <w:r>
-              <w:t xml:space="preserve">GMs + BMs</w:t>
+              <w:t xml:space="preserve">BMs + MAs/MTs</w:t>
             </w:r>
           </w:p>
         </w:tc>
@@ -4277,6 +4402,222 @@
               <w:pStyle w:val="Compact"/>
             </w:pPr>
             <w:r>
+              <w:t xml:space="preserve">2</w:t>
+            </w:r>
+          </w:p>
+        </w:tc>
+        <w:tc>
+          <w:tcPr/>
+          <w:p>
+            <w:pPr>
+              <w:pStyle w:val="Compact"/>
+            </w:pPr>
+            <w:r>
+              <w:t xml:space="preserve">Wed18 Mar</w:t>
+            </w:r>
+          </w:p>
+        </w:tc>
+        <w:tc>
+          <w:tcPr/>
+          <w:p>
+            <w:pPr>
+              <w:pStyle w:val="Compact"/>
+            </w:pPr>
+            <w:r>
+              <w:t xml:space="preserve">Own It: The</w:t>
+            </w:r>
+            <w:r>
+              <w:t xml:space="preserve"> </w:t>
+            </w:r>
+            <w:r>
+              <w:t xml:space="preserve">“Yes We Can”</w:t>
+            </w:r>
+            <w:r>
+              <w:t xml:space="preserve"> </w:t>
+            </w:r>
+            <w:r>
+              <w:t xml:space="preserve">Mentality</w:t>
+            </w:r>
+          </w:p>
+        </w:tc>
+        <w:tc>
+          <w:tcPr/>
+          <w:p>
+            <w:pPr>
+              <w:pStyle w:val="Compact"/>
+            </w:pPr>
+            <w:r>
+              <w:t xml:space="preserve">Gim Unfiltered Ep. 1</w:t>
+            </w:r>
+          </w:p>
+        </w:tc>
+        <w:tc>
+          <w:tcPr/>
+          <w:p>
+            <w:pPr>
+              <w:pStyle w:val="Compact"/>
+            </w:pPr>
+            <w:r>
+              <w:t xml:space="preserve">BMs + MAs/MTs</w:t>
+            </w:r>
+          </w:p>
+        </w:tc>
+        <w:tc>
+          <w:tcPr/>
+          <w:p>
+            <w:pPr>
+              <w:pStyle w:val="Compact"/>
+            </w:pPr>
+            <w:r>
+              <w:t xml:space="preserve">Gim + Guest BMs</w:t>
+            </w:r>
+          </w:p>
+        </w:tc>
+      </w:tr>
+      <w:tr>
+        <w:tc>
+          <w:tcPr/>
+          <w:p>
+            <w:pPr>
+              <w:pStyle w:val="Compact"/>
+            </w:pPr>
+            <w:r>
+              <w:t xml:space="preserve">3</w:t>
+            </w:r>
+          </w:p>
+        </w:tc>
+        <w:tc>
+          <w:tcPr/>
+          <w:p>
+            <w:pPr>
+              <w:pStyle w:val="Compact"/>
+            </w:pPr>
+            <w:r>
+              <w:t xml:space="preserve">Wed1 Apr</w:t>
+            </w:r>
+          </w:p>
+        </w:tc>
+        <w:tc>
+          <w:tcPr/>
+          <w:p>
+            <w:pPr>
+              <w:pStyle w:val="Compact"/>
+            </w:pPr>
+            <w:r>
+              <w:t xml:space="preserve">Outbound Best Practices: Speed to Contact</w:t>
+            </w:r>
+          </w:p>
+        </w:tc>
+        <w:tc>
+          <w:tcPr/>
+          <w:p>
+            <w:pPr>
+              <w:pStyle w:val="Compact"/>
+            </w:pPr>
+            <w:r>
+              <w:t xml:space="preserve">Gim Unfiltered Ep. 2</w:t>
+            </w:r>
+          </w:p>
+        </w:tc>
+        <w:tc>
+          <w:tcPr/>
+          <w:p>
+            <w:pPr>
+              <w:pStyle w:val="Compact"/>
+            </w:pPr>
+            <w:r>
+              <w:t xml:space="preserve">BMs + MAs/MTs</w:t>
+            </w:r>
+          </w:p>
+        </w:tc>
+        <w:tc>
+          <w:tcPr/>
+          <w:p>
+            <w:pPr>
+              <w:pStyle w:val="Compact"/>
+            </w:pPr>
+            <w:r>
+              <w:t xml:space="preserve">Gim + Guest BMs</w:t>
+            </w:r>
+          </w:p>
+        </w:tc>
+      </w:tr>
+      <w:tr>
+        <w:tc>
+          <w:tcPr/>
+          <w:p>
+            <w:pPr>
+              <w:pStyle w:val="Compact"/>
+            </w:pPr>
+            <w:r>
+              <w:t xml:space="preserve">4</w:t>
+            </w:r>
+          </w:p>
+        </w:tc>
+        <w:tc>
+          <w:tcPr/>
+          <w:p>
+            <w:pPr>
+              <w:pStyle w:val="Compact"/>
+            </w:pPr>
+            <w:r>
+              <w:t xml:space="preserve">Wed15 Apr</w:t>
+            </w:r>
+          </w:p>
+        </w:tc>
+        <w:tc>
+          <w:tcPr/>
+          <w:p>
+            <w:pPr>
+              <w:pStyle w:val="Compact"/>
+            </w:pPr>
+            <w:r>
+              <w:t xml:space="preserve">Inbound Best Practices: Every Call Answered</w:t>
+            </w:r>
+          </w:p>
+        </w:tc>
+        <w:tc>
+          <w:tcPr/>
+          <w:p>
+            <w:pPr>
+              <w:pStyle w:val="Compact"/>
+            </w:pPr>
+            <w:r>
+              <w:t xml:space="preserve">Gim Unfiltered Ep. 3</w:t>
+            </w:r>
+          </w:p>
+        </w:tc>
+        <w:tc>
+          <w:tcPr/>
+          <w:p>
+            <w:pPr>
+              <w:pStyle w:val="Compact"/>
+            </w:pPr>
+            <w:r>
+              <w:t xml:space="preserve">BMs + MAs/MTs</w:t>
+            </w:r>
+          </w:p>
+        </w:tc>
+        <w:tc>
+          <w:tcPr/>
+          <w:p>
+            <w:pPr>
+              <w:pStyle w:val="Compact"/>
+            </w:pPr>
+            <w:r>
+              <w:t xml:space="preserve">Gim + Guest BM</w:t>
+            </w:r>
+          </w:p>
+        </w:tc>
+      </w:tr>
+      <w:tr>
+        <w:tc>
+          <w:tcPr/>
+          <w:p>
+            <w:pPr>
+              <w:pStyle w:val="Compact"/>
+            </w:pPr>
+            <w:r>
               <w:t xml:space="preserve">—</w:t>
             </w:r>
           </w:p>
@@ -4288,7 +4629,7 @@
               <w:pStyle w:val="Compact"/>
             </w:pPr>
             <w:r>
-              <w:t xml:space="preserve">w/c 10 Mar</w:t>
+              <w:t xml:space="preserve">w/c 21 Apr</w:t>
             </w:r>
           </w:p>
         </w:tc>
@@ -4345,63 +4686,51 @@
               <w:pStyle w:val="Compact"/>
             </w:pPr>
             <w:r>
-              <w:t xml:space="preserve">2</w:t>
-            </w:r>
-          </w:p>
-        </w:tc>
-        <w:tc>
-          <w:tcPr/>
-          <w:p>
-            <w:pPr>
-              <w:pStyle w:val="Compact"/>
-            </w:pPr>
-            <w:r>
-              <w:t xml:space="preserve">Tue 18 Mar</w:t>
-            </w:r>
-          </w:p>
-        </w:tc>
-        <w:tc>
-          <w:tcPr/>
-          <w:p>
-            <w:pPr>
-              <w:pStyle w:val="Compact"/>
-            </w:pPr>
-            <w:r>
-              <w:t xml:space="preserve">Own It: The</w:t>
-            </w:r>
-            <w:r>
-              <w:t xml:space="preserve"> </w:t>
-            </w:r>
-            <w:r>
-              <w:t xml:space="preserve">“Yes We Can”</w:t>
-            </w:r>
-            <w:r>
-              <w:t xml:space="preserve"> </w:t>
-            </w:r>
-            <w:r>
-              <w:t xml:space="preserve">Mentality</w:t>
-            </w:r>
-          </w:p>
-        </w:tc>
-        <w:tc>
-          <w:tcPr/>
-          <w:p>
-            <w:pPr>
-              <w:pStyle w:val="Compact"/>
-            </w:pPr>
-            <w:r>
-              <w:t xml:space="preserve">Gim Unfiltered Ep. 1</w:t>
-            </w:r>
-          </w:p>
-        </w:tc>
-        <w:tc>
-          <w:tcPr/>
-          <w:p>
-            <w:pPr>
-              <w:pStyle w:val="Compact"/>
-            </w:pPr>
-            <w:r>
-              <w:t xml:space="preserve">BMs</w:t>
+              <w:t xml:space="preserve">5</w:t>
+            </w:r>
+          </w:p>
+        </w:tc>
+        <w:tc>
+          <w:tcPr/>
+          <w:p>
+            <w:pPr>
+              <w:pStyle w:val="Compact"/>
+            </w:pPr>
+            <w:r>
+              <w:t xml:space="preserve">Wed29 Apr</w:t>
+            </w:r>
+          </w:p>
+        </w:tc>
+        <w:tc>
+          <w:tcPr/>
+          <w:p>
+            <w:pPr>
+              <w:pStyle w:val="Compact"/>
+            </w:pPr>
+            <w:r>
+              <w:t xml:space="preserve">Protect It: Preventing Body Shop Flips</w:t>
+            </w:r>
+          </w:p>
+        </w:tc>
+        <w:tc>
+          <w:tcPr/>
+          <w:p>
+            <w:pPr>
+              <w:pStyle w:val="Compact"/>
+            </w:pPr>
+            <w:r>
+              <w:t xml:space="preserve">Gim Unfiltered Ep. 4</w:t>
+            </w:r>
+          </w:p>
+        </w:tc>
+        <w:tc>
+          <w:tcPr/>
+          <w:p>
+            <w:pPr>
+              <w:pStyle w:val="Compact"/>
+            </w:pPr>
+            <w:r>
+              <w:t xml:space="preserve">BMs + MAs/MTs</w:t>
             </w:r>
           </w:p>
         </w:tc>
@@ -4425,51 +4754,51 @@
               <w:pStyle w:val="Compact"/>
             </w:pPr>
             <w:r>
-              <w:t xml:space="preserve">3</w:t>
-            </w:r>
-          </w:p>
-        </w:tc>
-        <w:tc>
-          <w:tcPr/>
-          <w:p>
-            <w:pPr>
-              <w:pStyle w:val="Compact"/>
-            </w:pPr>
-            <w:r>
-              <w:t xml:space="preserve">Tue 1 Apr</w:t>
-            </w:r>
-          </w:p>
-        </w:tc>
-        <w:tc>
-          <w:tcPr/>
-          <w:p>
-            <w:pPr>
-              <w:pStyle w:val="Compact"/>
-            </w:pPr>
-            <w:r>
-              <w:t xml:space="preserve">Outbound Best Practices: Speed to Contact</w:t>
-            </w:r>
-          </w:p>
-        </w:tc>
-        <w:tc>
-          <w:tcPr/>
-          <w:p>
-            <w:pPr>
-              <w:pStyle w:val="Compact"/>
-            </w:pPr>
-            <w:r>
-              <w:t xml:space="preserve">Gim Unfiltered Ep. 2</w:t>
-            </w:r>
-          </w:p>
-        </w:tc>
-        <w:tc>
-          <w:tcPr/>
-          <w:p>
-            <w:pPr>
-              <w:pStyle w:val="Compact"/>
-            </w:pPr>
-            <w:r>
-              <w:t xml:space="preserve">BMs</w:t>
+              <w:t xml:space="preserve">6</w:t>
+            </w:r>
+          </w:p>
+        </w:tc>
+        <w:tc>
+          <w:tcPr/>
+          <w:p>
+            <w:pPr>
+              <w:pStyle w:val="Compact"/>
+            </w:pPr>
+            <w:r>
+              <w:t xml:space="preserve">Wed13 May</w:t>
+            </w:r>
+          </w:p>
+        </w:tc>
+        <w:tc>
+          <w:tcPr/>
+          <w:p>
+            <w:pPr>
+              <w:pStyle w:val="Compact"/>
+            </w:pPr>
+            <w:r>
+              <w:t xml:space="preserve">Building Body Shop Relationships</w:t>
+            </w:r>
+          </w:p>
+        </w:tc>
+        <w:tc>
+          <w:tcPr/>
+          <w:p>
+            <w:pPr>
+              <w:pStyle w:val="Compact"/>
+            </w:pPr>
+            <w:r>
+              <w:t xml:space="preserve">Gim Unfiltered Ep. 5</w:t>
+            </w:r>
+          </w:p>
+        </w:tc>
+        <w:tc>
+          <w:tcPr/>
+          <w:p>
+            <w:pPr>
+              <w:pStyle w:val="Compact"/>
+            </w:pPr>
+            <w:r>
+              <w:t xml:space="preserve">BMs + MAs/MTs</w:t>
             </w:r>
           </w:p>
         </w:tc>
@@ -4493,51 +4822,119 @@
               <w:pStyle w:val="Compact"/>
             </w:pPr>
             <w:r>
-              <w:t xml:space="preserve">4</w:t>
-            </w:r>
-          </w:p>
-        </w:tc>
-        <w:tc>
-          <w:tcPr/>
-          <w:p>
-            <w:pPr>
-              <w:pStyle w:val="Compact"/>
-            </w:pPr>
-            <w:r>
-              <w:t xml:space="preserve">Tue 15 Apr</w:t>
-            </w:r>
-          </w:p>
-        </w:tc>
-        <w:tc>
-          <w:tcPr/>
-          <w:p>
-            <w:pPr>
-              <w:pStyle w:val="Compact"/>
-            </w:pPr>
-            <w:r>
-              <w:t xml:space="preserve">Inbound Best Practices: Every Call Answered</w:t>
-            </w:r>
-          </w:p>
-        </w:tc>
-        <w:tc>
-          <w:tcPr/>
-          <w:p>
-            <w:pPr>
-              <w:pStyle w:val="Compact"/>
-            </w:pPr>
-            <w:r>
-              <w:t xml:space="preserve">Gim Unfiltered Ep. 3</w:t>
-            </w:r>
-          </w:p>
-        </w:tc>
-        <w:tc>
-          <w:tcPr/>
-          <w:p>
-            <w:pPr>
-              <w:pStyle w:val="Compact"/>
-            </w:pPr>
-            <w:r>
-              <w:t xml:space="preserve">BMs</w:t>
+              <w:t xml:space="preserve">7</w:t>
+            </w:r>
+          </w:p>
+        </w:tc>
+        <w:tc>
+          <w:tcPr/>
+          <w:p>
+            <w:pPr>
+              <w:pStyle w:val="Compact"/>
+            </w:pPr>
+            <w:r>
+              <w:t xml:space="preserve">Wed27 May</w:t>
+            </w:r>
+          </w:p>
+        </w:tc>
+        <w:tc>
+          <w:tcPr/>
+          <w:p>
+            <w:pPr>
+              <w:pStyle w:val="Compact"/>
+            </w:pPr>
+            <w:r>
+              <w:t xml:space="preserve">Customer Journey: Building Empathy</w:t>
+            </w:r>
+          </w:p>
+        </w:tc>
+        <w:tc>
+          <w:tcPr/>
+          <w:p>
+            <w:pPr>
+              <w:pStyle w:val="Compact"/>
+            </w:pPr>
+            <w:r>
+              <w:t xml:space="preserve">Gim Unfiltered Ep. 6</w:t>
+            </w:r>
+          </w:p>
+        </w:tc>
+        <w:tc>
+          <w:tcPr/>
+          <w:p>
+            <w:pPr>
+              <w:pStyle w:val="Compact"/>
+            </w:pPr>
+            <w:r>
+              <w:t xml:space="preserve">BMs + MAs/MTs</w:t>
+            </w:r>
+          </w:p>
+        </w:tc>
+        <w:tc>
+          <w:tcPr/>
+          <w:p>
+            <w:pPr>
+              <w:pStyle w:val="Compact"/>
+            </w:pPr>
+            <w:r>
+              <w:t xml:space="preserve">Gim</w:t>
+            </w:r>
+          </w:p>
+        </w:tc>
+      </w:tr>
+      <w:tr>
+        <w:tc>
+          <w:tcPr/>
+          <w:p>
+            <w:pPr>
+              <w:pStyle w:val="Compact"/>
+            </w:pPr>
+            <w:r>
+              <w:t xml:space="preserve">8</w:t>
+            </w:r>
+          </w:p>
+        </w:tc>
+        <w:tc>
+          <w:tcPr/>
+          <w:p>
+            <w:pPr>
+              <w:pStyle w:val="Compact"/>
+            </w:pPr>
+            <w:r>
+              <w:t xml:space="preserve">Wed10 Jun</w:t>
+            </w:r>
+          </w:p>
+        </w:tc>
+        <w:tc>
+          <w:tcPr/>
+          <w:p>
+            <w:pPr>
+              <w:pStyle w:val="Compact"/>
+            </w:pPr>
+            <w:r>
+              <w:t xml:space="preserve">Weekly Leads Review &amp; Conversion Tracking</w:t>
+            </w:r>
+          </w:p>
+        </w:tc>
+        <w:tc>
+          <w:tcPr/>
+          <w:p>
+            <w:pPr>
+              <w:pStyle w:val="Compact"/>
+            </w:pPr>
+            <w:r>
+              <w:t xml:space="preserve">Gim Unfiltered Ep. 7</w:t>
+            </w:r>
+          </w:p>
+        </w:tc>
+        <w:tc>
+          <w:tcPr/>
+          <w:p>
+            <w:pPr>
+              <w:pStyle w:val="Compact"/>
+            </w:pPr>
+            <w:r>
+              <w:t xml:space="preserve">BMs + MAs/MTs</w:t>
             </w:r>
           </w:p>
         </w:tc>
@@ -4549,278 +4946,6 @@
             </w:pPr>
             <w:r>
               <w:t xml:space="preserve">Gim + Guest BM</w:t>
-            </w:r>
-          </w:p>
-        </w:tc>
-      </w:tr>
-      <w:tr>
-        <w:tc>
-          <w:tcPr/>
-          <w:p>
-            <w:pPr>
-              <w:pStyle w:val="Compact"/>
-            </w:pPr>
-            <w:r>
-              <w:t xml:space="preserve">5</w:t>
-            </w:r>
-          </w:p>
-        </w:tc>
-        <w:tc>
-          <w:tcPr/>
-          <w:p>
-            <w:pPr>
-              <w:pStyle w:val="Compact"/>
-            </w:pPr>
-            <w:r>
-              <w:t xml:space="preserve">Tue 29 Apr</w:t>
-            </w:r>
-          </w:p>
-        </w:tc>
-        <w:tc>
-          <w:tcPr/>
-          <w:p>
-            <w:pPr>
-              <w:pStyle w:val="Compact"/>
-            </w:pPr>
-            <w:r>
-              <w:t xml:space="preserve">Protect It: Preventing Body Shop Flips</w:t>
-            </w:r>
-          </w:p>
-        </w:tc>
-        <w:tc>
-          <w:tcPr/>
-          <w:p>
-            <w:pPr>
-              <w:pStyle w:val="Compact"/>
-            </w:pPr>
-            <w:r>
-              <w:t xml:space="preserve">Gim Unfiltered Ep. 4</w:t>
-            </w:r>
-          </w:p>
-        </w:tc>
-        <w:tc>
-          <w:tcPr/>
-          <w:p>
-            <w:pPr>
-              <w:pStyle w:val="Compact"/>
-            </w:pPr>
-            <w:r>
-              <w:t xml:space="preserve">GMs + BMs</w:t>
-            </w:r>
-          </w:p>
-        </w:tc>
-        <w:tc>
-          <w:tcPr/>
-          <w:p>
-            <w:pPr>
-              <w:pStyle w:val="Compact"/>
-            </w:pPr>
-            <w:r>
-              <w:t xml:space="preserve">Gim + Guest BMs</w:t>
-            </w:r>
-          </w:p>
-        </w:tc>
-      </w:tr>
-      <w:tr>
-        <w:tc>
-          <w:tcPr/>
-          <w:p>
-            <w:pPr>
-              <w:pStyle w:val="Compact"/>
-            </w:pPr>
-            <w:r>
-              <w:t xml:space="preserve">6</w:t>
-            </w:r>
-          </w:p>
-        </w:tc>
-        <w:tc>
-          <w:tcPr/>
-          <w:p>
-            <w:pPr>
-              <w:pStyle w:val="Compact"/>
-            </w:pPr>
-            <w:r>
-              <w:t xml:space="preserve">Tue 13 May</w:t>
-            </w:r>
-          </w:p>
-        </w:tc>
-        <w:tc>
-          <w:tcPr/>
-          <w:p>
-            <w:pPr>
-              <w:pStyle w:val="Compact"/>
-            </w:pPr>
-            <w:r>
-              <w:t xml:space="preserve">Building Body Shop Relationships</w:t>
-            </w:r>
-          </w:p>
-        </w:tc>
-        <w:tc>
-          <w:tcPr/>
-          <w:p>
-            <w:pPr>
-              <w:pStyle w:val="Compact"/>
-            </w:pPr>
-            <w:r>
-              <w:t xml:space="preserve">Gim Unfiltered Ep. 5</w:t>
-            </w:r>
-          </w:p>
-        </w:tc>
-        <w:tc>
-          <w:tcPr/>
-          <w:p>
-            <w:pPr>
-              <w:pStyle w:val="Compact"/>
-            </w:pPr>
-            <w:r>
-              <w:t xml:space="preserve">BMs</w:t>
-            </w:r>
-          </w:p>
-        </w:tc>
-        <w:tc>
-          <w:tcPr/>
-          <w:p>
-            <w:pPr>
-              <w:pStyle w:val="Compact"/>
-            </w:pPr>
-            <w:r>
-              <w:t xml:space="preserve">Gim + Guest BMs</w:t>
-            </w:r>
-          </w:p>
-        </w:tc>
-      </w:tr>
-      <w:tr>
-        <w:tc>
-          <w:tcPr/>
-          <w:p>
-            <w:pPr>
-              <w:pStyle w:val="Compact"/>
-            </w:pPr>
-            <w:r>
-              <w:t xml:space="preserve">7</w:t>
-            </w:r>
-          </w:p>
-        </w:tc>
-        <w:tc>
-          <w:tcPr/>
-          <w:p>
-            <w:pPr>
-              <w:pStyle w:val="Compact"/>
-            </w:pPr>
-            <w:r>
-              <w:t xml:space="preserve">Tue 27 May</w:t>
-            </w:r>
-          </w:p>
-        </w:tc>
-        <w:tc>
-          <w:tcPr/>
-          <w:p>
-            <w:pPr>
-              <w:pStyle w:val="Compact"/>
-            </w:pPr>
-            <w:r>
-              <w:t xml:space="preserve">Customer Journey: Building Empathy</w:t>
-            </w:r>
-          </w:p>
-        </w:tc>
-        <w:tc>
-          <w:tcPr/>
-          <w:p>
-            <w:pPr>
-              <w:pStyle w:val="Compact"/>
-            </w:pPr>
-            <w:r>
-              <w:t xml:space="preserve">Gim Unfiltered Ep. 6</w:t>
-            </w:r>
-          </w:p>
-        </w:tc>
-        <w:tc>
-          <w:tcPr/>
-          <w:p>
-            <w:pPr>
-              <w:pStyle w:val="Compact"/>
-            </w:pPr>
-            <w:r>
-              <w:t xml:space="preserve">GMs + BMs</w:t>
-            </w:r>
-          </w:p>
-        </w:tc>
-        <w:tc>
-          <w:tcPr/>
-          <w:p>
-            <w:pPr>
-              <w:pStyle w:val="Compact"/>
-            </w:pPr>
-            <w:r>
-              <w:t xml:space="preserve">Gim</w:t>
-            </w:r>
-          </w:p>
-        </w:tc>
-      </w:tr>
-      <w:tr>
-        <w:tc>
-          <w:tcPr/>
-          <w:p>
-            <w:pPr>
-              <w:pStyle w:val="Compact"/>
-            </w:pPr>
-            <w:r>
-              <w:t xml:space="preserve">8</w:t>
-            </w:r>
-          </w:p>
-        </w:tc>
-        <w:tc>
-          <w:tcPr/>
-          <w:p>
-            <w:pPr>
-              <w:pStyle w:val="Compact"/>
-            </w:pPr>
-            <w:r>
-              <w:t xml:space="preserve">Tue 10 Jun</w:t>
-            </w:r>
-          </w:p>
-        </w:tc>
-        <w:tc>
-          <w:tcPr/>
-          <w:p>
-            <w:pPr>
-              <w:pStyle w:val="Compact"/>
-            </w:pPr>
-            <w:r>
-              <w:t xml:space="preserve">Weekly Leads Review &amp; Conversion Tracking</w:t>
-            </w:r>
-          </w:p>
-        </w:tc>
-        <w:tc>
-          <w:tcPr/>
-          <w:p>
-            <w:pPr>
-              <w:pStyle w:val="Compact"/>
-            </w:pPr>
-            <w:r>
-              <w:t xml:space="preserve">Gim Unfiltered Ep. 7</w:t>
-            </w:r>
-          </w:p>
-        </w:tc>
-        <w:tc>
-          <w:tcPr/>
-          <w:p>
-            <w:pPr>
-              <w:pStyle w:val="Compact"/>
-            </w:pPr>
-            <w:r>
-              <w:t xml:space="preserve">GMs + BMs</w:t>
-            </w:r>
-          </w:p>
-        </w:tc>
-        <w:tc>
-          <w:tcPr/>
-          <w:p>
-            <w:pPr>
-              <w:pStyle w:val="Compact"/>
-            </w:pPr>
-            <w:r>
-              <w:t xml:space="preserve">Gim + Guest GM</w:t>
             </w:r>
           </w:p>
         </w:tc>
@@ -4833,8 +4958,8 @@
         </w:pict>
       </w:r>
     </w:p>
-    <w:bookmarkEnd w:id="32"/>
-    <w:bookmarkStart w:id="33" w:name="ongoing-accountability-tracking"/>
+    <w:bookmarkEnd w:id="35"/>
+    <w:bookmarkStart w:id="36" w:name="ongoing-accountability-tracking"/>
     <w:p>
       <w:pPr>
         <w:pStyle w:val="Heading2"/>
@@ -5104,8 +5229,8 @@
         </w:pict>
       </w:r>
     </w:p>
-    <w:bookmarkEnd w:id="33"/>
-    <w:bookmarkStart w:id="34" w:name="success-measures"/>
+    <w:bookmarkEnd w:id="36"/>
+    <w:bookmarkStart w:id="37" w:name="success-measures"/>
     <w:p>
       <w:pPr>
         <w:pStyle w:val="Heading2"/>
@@ -5358,14 +5483,14 @@
         </w:pict>
       </w:r>
     </w:p>
-    <w:bookmarkEnd w:id="34"/>
-    <w:bookmarkStart w:id="35" w:name="what-we-need-from-you-gimnick"/>
+    <w:bookmarkEnd w:id="37"/>
+    <w:bookmarkStart w:id="38" w:name="what-we-still-need-gimnick"/>
     <w:p>
       <w:pPr>
         <w:pStyle w:val="Heading2"/>
       </w:pPr>
       <w:r>
-        <w:t xml:space="preserve">10. What We Need from You (Gim/Nick)</w:t>
+        <w:t xml:space="preserve">10. What We Still Need (Gim/Nick)</w:t>
       </w:r>
     </w:p>
     <w:p>
@@ -5373,7 +5498,7 @@
         <w:pStyle w:val="Compact"/>
         <w:numPr>
           <w:ilvl w:val="0"/>
-          <w:numId w:val="1006"/>
+          <w:numId w:val="1010"/>
         </w:numPr>
       </w:pPr>
       <w:r>
@@ -5395,7 +5520,7 @@
         <w:pStyle w:val="Compact"/>
         <w:numPr>
           <w:ilvl w:val="0"/>
-          <w:numId w:val="1006"/>
+          <w:numId w:val="1010"/>
         </w:numPr>
       </w:pPr>
       <w:r>
@@ -5417,29 +5542,7 @@
         <w:pStyle w:val="Compact"/>
         <w:numPr>
           <w:ilvl w:val="0"/>
-          <w:numId w:val="1006"/>
-        </w:numPr>
-      </w:pPr>
-      <w:r>
-        <w:rPr>
-          <w:b/>
-          <w:bCs/>
-        </w:rPr>
-        <w:t xml:space="preserve">Confirm audience decisions</w:t>
-      </w:r>
-      <w:r>
-        <w:t xml:space="preserve"> </w:t>
-      </w:r>
-      <w:r>
-        <w:t xml:space="preserve">— which sessions are BM-only, which include GMs, any sessions for broader audience?</w:t>
-      </w:r>
-    </w:p>
-    <w:p>
-      <w:pPr>
-        <w:pStyle w:val="Compact"/>
-        <w:numPr>
-          <w:ilvl w:val="0"/>
-          <w:numId w:val="1006"/>
+          <w:numId w:val="1010"/>
         </w:numPr>
       </w:pPr>
       <w:r>
@@ -5461,7 +5564,7 @@
         <w:pStyle w:val="Compact"/>
         <w:numPr>
           <w:ilvl w:val="0"/>
-          <w:numId w:val="1006"/>
+          <w:numId w:val="1010"/>
         </w:numPr>
       </w:pPr>
       <w:r>
@@ -5483,29 +5586,7 @@
         <w:pStyle w:val="Compact"/>
         <w:numPr>
           <w:ilvl w:val="0"/>
-          <w:numId w:val="1006"/>
-        </w:numPr>
-      </w:pPr>
-      <w:r>
-        <w:rPr>
-          <w:b/>
-          <w:bCs/>
-        </w:rPr>
-        <w:t xml:space="preserve">Cascade sessions</w:t>
-      </w:r>
-      <w:r>
-        <w:t xml:space="preserve"> </w:t>
-      </w:r>
-      <w:r>
-        <w:t xml:space="preserve">— do you want GMs to run regional follow-ups? If so, which topics?</w:t>
-      </w:r>
-    </w:p>
-    <w:p>
-      <w:pPr>
-        <w:pStyle w:val="Compact"/>
-        <w:numPr>
-          <w:ilvl w:val="0"/>
-          <w:numId w:val="1006"/>
+          <w:numId w:val="1010"/>
         </w:numPr>
       </w:pPr>
       <w:r>
@@ -5523,6 +5604,24 @@
       </w:r>
     </w:p>
     <w:p>
+      <w:pPr>
+        <w:pStyle w:val="BlockText"/>
+      </w:pPr>
+      <w:r>
+        <w:rPr>
+          <w:b/>
+          <w:bCs/>
+        </w:rPr>
+        <w:t xml:space="preserve">Resolved:</w:t>
+      </w:r>
+      <w:r>
+        <w:t xml:space="preserve"> </w:t>
+      </w:r>
+      <w:r>
+        <w:t xml:space="preserve">Audience confirmed as BMs + MAs/MTs (AMs/GMs on separate monthly cadence). Session format confirmed as one-way broadcast. Cascade sessions replaced by GM/AM monthly calls.</w:t>
+      </w:r>
+    </w:p>
+    <w:p>
       <w:r>
         <w:pict>
           <v:rect style="width:0;height:1.5pt" o:hralign="center" o:hrstd="t" o:hr="t"/>
@@ -5541,8 +5640,8 @@
         <w:t xml:space="preserve">This is a living document. It will be updated based on Gim’s input and refined as the campaign progresses.</w:t>
       </w:r>
     </w:p>
-    <w:bookmarkEnd w:id="35"/>
-    <w:bookmarkEnd w:id="36"/>
+    <w:bookmarkEnd w:id="38"/>
+    <w:bookmarkEnd w:id="39"/>
     <w:sectPr>
       <w:footnotePr>
         <w:numRestart w:val="eachSect"/>
@@ -5857,9 +5956,48 @@
     <w:abstractNumId w:val="991"/>
   </w:num>
   <w:num w:numId="1005">
+    <w:abstractNumId w:val="99411"/>
+    <w:lvlOverride w:ilvl="0">
+      <w:startOverride w:val="1"/>
+    </w:lvlOverride>
+    <w:lvlOverride w:ilvl="1">
+      <w:startOverride w:val="1"/>
+    </w:lvlOverride>
+    <w:lvlOverride w:ilvl="2">
+      <w:startOverride w:val="1"/>
+    </w:lvlOverride>
+    <w:lvlOverride w:ilvl="3">
+      <w:startOverride w:val="1"/>
+    </w:lvlOverride>
+    <w:lvlOverride w:ilvl="4">
+      <w:startOverride w:val="1"/>
+    </w:lvlOverride>
+    <w:lvlOverride w:ilvl="5">
+      <w:startOverride w:val="1"/>
+    </w:lvlOverride>
+    <w:lvlOverride w:ilvl="6">
+      <w:startOverride w:val="1"/>
+    </w:lvlOverride>
+    <w:lvlOverride w:ilvl="7">
+      <w:startOverride w:val="1"/>
+    </w:lvlOverride>
+    <w:lvlOverride w:ilvl="8">
+      <w:startOverride w:val="1"/>
+    </w:lvlOverride>
+  </w:num>
+  <w:num w:numId="1006">
     <w:abstractNumId w:val="991"/>
   </w:num>
-  <w:num w:numId="1006">
+  <w:num w:numId="1007">
+    <w:abstractNumId w:val="991"/>
+  </w:num>
+  <w:num w:numId="1008">
+    <w:abstractNumId w:val="991"/>
+  </w:num>
+  <w:num w:numId="1009">
+    <w:abstractNumId w:val="991"/>
+  </w:num>
+  <w:num w:numId="1010">
     <w:abstractNumId w:val="99411"/>
     <w:lvlOverride w:ilvl="0">
       <w:startOverride w:val="1"/>

</xml_diff>